<commit_message>
nmv 24 05 2026
</commit_message>
<xml_diff>
--- a/TS Jatai Ghanam Project/TS 1.1/TS 1.1 Ghanam Sanskrit Corrections.docx
+++ b/TS Jatai Ghanam Project/TS 1.1/TS 1.1 Ghanam Sanskrit Corrections.docx
@@ -41,7 +41,7 @@
           <w:szCs w:val="32"/>
           <w:u w:val="single"/>
         </w:rPr>
-        <w:t xml:space="preserve"> </w:t>
+        <w:t xml:space="preserve"> Corrections – Observed till </w:t>
       </w:r>
       <w:r>
         <w:rPr>
@@ -51,18 +51,7 @@
           <w:szCs w:val="32"/>
           <w:u w:val="single"/>
         </w:rPr>
-        <w:t xml:space="preserve">Corrections – Observed till </w:t>
-      </w:r>
-      <w:r>
-        <w:rPr>
-          <w:b/>
-          <w:bCs/>
-          <w:sz w:val="32"/>
-          <w:szCs w:val="32"/>
-          <w:highlight w:val="red"/>
-          <w:u w:val="single"/>
-        </w:rPr>
-        <w:t>????</w:t>
+        <w:t>30th June 2026</w:t>
       </w:r>
     </w:p>
     <w:p>
@@ -182,6 +171,533 @@
       </w:tblGrid>
       <w:tr>
         <w:trPr>
+          <w:trHeight w:val="1182"/>
+        </w:trPr>
+        <w:tc>
+          <w:tcPr>
+            <w:tcW w:w="6408" w:type="dxa"/>
+          </w:tcPr>
+          <w:p>
+            <w:pPr>
+              <w:widowControl w:val="0"/>
+              <w:autoSpaceDE w:val="0"/>
+              <w:autoSpaceDN w:val="0"/>
+              <w:adjustRightInd w:val="0"/>
+              <w:rPr>
+                <w:rFonts w:ascii="BRH Devanagari Extra" w:hAnsi="BRH Devanagari Extra" w:cs="BRH Devanagari Extra"/>
+                <w:color w:val="000000"/>
+                <w:sz w:val="32"/>
+                <w:szCs w:val="40"/>
+              </w:rPr>
+            </w:pPr>
+            <w:r>
+              <w:rPr>
+                <w:rFonts w:cs="BRH Devanagari Extra"/>
+                <w:color w:val="000000"/>
+                <w:szCs w:val="40"/>
+              </w:rPr>
+              <w:t>57</w:t>
+            </w:r>
+            <w:r>
+              <w:rPr>
+                <w:rFonts w:ascii="BRH Devanagari Extra" w:hAnsi="BRH Devanagari Extra" w:cs="BRH Devanagari Extra"/>
+                <w:color w:val="000000"/>
+                <w:sz w:val="32"/>
+                <w:szCs w:val="40"/>
+              </w:rPr>
+              <w:t>)</w:t>
+            </w:r>
+            <w:r>
+              <w:rPr>
+                <w:rFonts w:ascii="BRH Devanagari Extra" w:hAnsi="BRH Devanagari Extra" w:cs="BRH Devanagari Extra"/>
+                <w:color w:val="000000"/>
+                <w:sz w:val="32"/>
+                <w:szCs w:val="40"/>
+              </w:rPr>
+              <w:tab/>
+            </w:r>
+            <w:r>
+              <w:rPr>
+                <w:rFonts w:cs="BRH Devanagari Extra"/>
+                <w:color w:val="000000"/>
+                <w:szCs w:val="40"/>
+              </w:rPr>
+              <w:t>1</w:t>
+            </w:r>
+            <w:r>
+              <w:rPr>
+                <w:rFonts w:ascii="BRH Devanagari Extra" w:hAnsi="BRH Devanagari Extra" w:cs="BRH Devanagari Extra"/>
+                <w:color w:val="000000"/>
+                <w:sz w:val="32"/>
+                <w:szCs w:val="40"/>
+              </w:rPr>
+              <w:t>.</w:t>
+            </w:r>
+            <w:r>
+              <w:rPr>
+                <w:rFonts w:cs="BRH Devanagari Extra"/>
+                <w:color w:val="000000"/>
+                <w:szCs w:val="40"/>
+              </w:rPr>
+              <w:t>1</w:t>
+            </w:r>
+            <w:r>
+              <w:rPr>
+                <w:rFonts w:ascii="BRH Devanagari Extra" w:hAnsi="BRH Devanagari Extra" w:cs="BRH Devanagari Extra"/>
+                <w:color w:val="000000"/>
+                <w:sz w:val="32"/>
+                <w:szCs w:val="40"/>
+              </w:rPr>
+              <w:t>.</w:t>
+            </w:r>
+            <w:r>
+              <w:rPr>
+                <w:rFonts w:cs="BRH Devanagari Extra"/>
+                <w:color w:val="000000"/>
+                <w:szCs w:val="40"/>
+              </w:rPr>
+              <w:t>6</w:t>
+            </w:r>
+            <w:r>
+              <w:rPr>
+                <w:rFonts w:ascii="BRH Devanagari Extra" w:hAnsi="BRH Devanagari Extra" w:cs="BRH Devanagari Extra"/>
+                <w:color w:val="000000"/>
+                <w:sz w:val="32"/>
+                <w:szCs w:val="40"/>
+              </w:rPr>
+              <w:t>.</w:t>
+            </w:r>
+            <w:r>
+              <w:rPr>
+                <w:rFonts w:cs="BRH Devanagari Extra"/>
+                <w:color w:val="000000"/>
+                <w:szCs w:val="40"/>
+              </w:rPr>
+              <w:t>1</w:t>
+            </w:r>
+            <w:r>
+              <w:rPr>
+                <w:rFonts w:ascii="BRH Devanagari Extra" w:hAnsi="BRH Devanagari Extra" w:cs="BRH Devanagari Extra"/>
+                <w:color w:val="000000"/>
+                <w:sz w:val="32"/>
+                <w:szCs w:val="40"/>
+              </w:rPr>
+              <w:t>(</w:t>
+            </w:r>
+            <w:r>
+              <w:rPr>
+                <w:rFonts w:cs="BRH Devanagari Extra"/>
+                <w:color w:val="000000"/>
+                <w:szCs w:val="40"/>
+              </w:rPr>
+              <w:t>51</w:t>
+            </w:r>
+            <w:r>
+              <w:rPr>
+                <w:rFonts w:ascii="BRH Devanagari Extra" w:hAnsi="BRH Devanagari Extra" w:cs="BRH Devanagari Extra"/>
+                <w:color w:val="000000"/>
+                <w:sz w:val="32"/>
+                <w:szCs w:val="40"/>
+              </w:rPr>
+              <w:t>)- A</w:t>
+            </w:r>
+            <w:r>
+              <w:rPr>
+                <w:rFonts w:ascii="BRH Malayalam Extra" w:hAnsi="BRH Malayalam Extra" w:cs="BRH Devanagari Extra"/>
+                <w:color w:val="000000"/>
+                <w:szCs w:val="40"/>
+              </w:rPr>
+              <w:t>–</w:t>
+            </w:r>
+            <w:r>
+              <w:rPr>
+                <w:rFonts w:ascii="BRH Devanagari Extra" w:hAnsi="BRH Devanagari Extra" w:cs="BRH Devanagari Extra"/>
+                <w:color w:val="000000"/>
+                <w:sz w:val="32"/>
+                <w:szCs w:val="40"/>
+              </w:rPr>
+              <w:t>mÉÉ</w:t>
+            </w:r>
+            <w:r>
+              <w:rPr>
+                <w:rFonts w:ascii="BRH Malayalam Extra" w:hAnsi="BRH Malayalam Extra" w:cs="BRH Devanagari Extra"/>
+                <w:color w:val="000000"/>
+                <w:szCs w:val="40"/>
+              </w:rPr>
+              <w:t>–</w:t>
+            </w:r>
+            <w:r>
+              <w:rPr>
+                <w:rFonts w:ascii="BRH Devanagari Extra" w:hAnsi="BRH Devanagari Extra" w:cs="BRH Devanagari Extra"/>
+                <w:color w:val="000000"/>
+                <w:sz w:val="32"/>
+                <w:szCs w:val="40"/>
+              </w:rPr>
+              <w:t>lÉÉrÉþ |</w:t>
+            </w:r>
+          </w:p>
+          <w:p>
+            <w:pPr>
+              <w:widowControl w:val="0"/>
+              <w:autoSpaceDE w:val="0"/>
+              <w:autoSpaceDN w:val="0"/>
+              <w:adjustRightInd w:val="0"/>
+              <w:rPr>
+                <w:rFonts w:cs="BRH Malayalam Extra"/>
+                <w:color w:val="000000"/>
+                <w:szCs w:val="40"/>
+              </w:rPr>
+            </w:pPr>
+            <w:r>
+              <w:rPr>
+                <w:rFonts w:ascii="BRH Devanagari Extra" w:hAnsi="BRH Devanagari Extra" w:cs="BRH Devanagari Extra"/>
+                <w:color w:val="000000"/>
+                <w:sz w:val="32"/>
+                <w:szCs w:val="40"/>
+              </w:rPr>
+              <w:t>A</w:t>
+            </w:r>
+            <w:r>
+              <w:rPr>
+                <w:rFonts w:ascii="BRH Malayalam Extra" w:hAnsi="BRH Malayalam Extra" w:cs="BRH Devanagari Extra"/>
+                <w:color w:val="000000"/>
+                <w:szCs w:val="40"/>
+              </w:rPr>
+              <w:t>–</w:t>
+            </w:r>
+            <w:r>
+              <w:rPr>
+                <w:rFonts w:ascii="BRH Devanagari Extra" w:hAnsi="BRH Devanagari Extra" w:cs="BRH Devanagari Extra"/>
+                <w:color w:val="000000"/>
+                <w:sz w:val="32"/>
+                <w:szCs w:val="40"/>
+              </w:rPr>
+              <w:t>mÉÉ</w:t>
+            </w:r>
+            <w:r>
+              <w:rPr>
+                <w:rFonts w:ascii="BRH Malayalam Extra" w:hAnsi="BRH Malayalam Extra" w:cs="BRH Devanagari Extra"/>
+                <w:color w:val="000000"/>
+                <w:szCs w:val="40"/>
+              </w:rPr>
+              <w:t>–</w:t>
+            </w:r>
+            <w:r>
+              <w:rPr>
+                <w:rFonts w:ascii="BRH Devanagari Extra" w:hAnsi="BRH Devanagari Extra" w:cs="BRH Devanagari Extra"/>
+                <w:color w:val="000000"/>
+                <w:sz w:val="32"/>
+                <w:szCs w:val="40"/>
+              </w:rPr>
+              <w:t>lÉÉ</w:t>
+            </w:r>
+            <w:r>
+              <w:rPr>
+                <w:rFonts w:ascii="BRH Devanagari Extra" w:hAnsi="BRH Devanagari Extra" w:cs="BRH Devanagari Extra"/>
+                <w:color w:val="000000"/>
+                <w:sz w:val="32"/>
+                <w:szCs w:val="40"/>
+                <w:highlight w:val="yellow"/>
+              </w:rPr>
+              <w:t>irÉåþ</w:t>
+            </w:r>
+            <w:r>
+              <w:rPr>
+                <w:rFonts w:ascii="BRH Devanagari Extra" w:hAnsi="BRH Devanagari Extra" w:cs="BRH Devanagari Extra"/>
+                <w:color w:val="000000"/>
+                <w:sz w:val="32"/>
+                <w:szCs w:val="40"/>
+              </w:rPr>
+              <w:t>mÉ - A</w:t>
+            </w:r>
+            <w:r>
+              <w:rPr>
+                <w:rFonts w:ascii="BRH Malayalam Extra" w:hAnsi="BRH Malayalam Extra" w:cs="BRH Devanagari Extra"/>
+                <w:color w:val="000000"/>
+                <w:szCs w:val="40"/>
+              </w:rPr>
+              <w:t>–</w:t>
+            </w:r>
+            <w:r>
+              <w:rPr>
+                <w:rFonts w:ascii="BRH Devanagari Extra" w:hAnsi="BRH Devanagari Extra" w:cs="BRH Devanagari Extra"/>
+                <w:color w:val="000000"/>
+                <w:sz w:val="32"/>
+                <w:szCs w:val="40"/>
+              </w:rPr>
+              <w:t xml:space="preserve">lÉÉrÉþ | </w:t>
+            </w:r>
+          </w:p>
+        </w:tc>
+        <w:tc>
+          <w:tcPr>
+            <w:tcW w:w="7513" w:type="dxa"/>
+          </w:tcPr>
+          <w:p>
+            <w:pPr>
+              <w:widowControl w:val="0"/>
+              <w:autoSpaceDE w:val="0"/>
+              <w:autoSpaceDN w:val="0"/>
+              <w:adjustRightInd w:val="0"/>
+              <w:rPr>
+                <w:rFonts w:ascii="BRH Devanagari Extra" w:hAnsi="BRH Devanagari Extra" w:cs="BRH Devanagari Extra"/>
+                <w:color w:val="000000"/>
+                <w:sz w:val="32"/>
+                <w:szCs w:val="40"/>
+              </w:rPr>
+            </w:pPr>
+            <w:r>
+              <w:rPr>
+                <w:rFonts w:cs="BRH Devanagari Extra"/>
+                <w:color w:val="000000"/>
+                <w:szCs w:val="40"/>
+              </w:rPr>
+              <w:t>57</w:t>
+            </w:r>
+            <w:r>
+              <w:rPr>
+                <w:rFonts w:ascii="BRH Devanagari Extra" w:hAnsi="BRH Devanagari Extra" w:cs="BRH Devanagari Extra"/>
+                <w:color w:val="000000"/>
+                <w:sz w:val="32"/>
+                <w:szCs w:val="40"/>
+              </w:rPr>
+              <w:t>)</w:t>
+            </w:r>
+            <w:r>
+              <w:rPr>
+                <w:rFonts w:ascii="BRH Devanagari Extra" w:hAnsi="BRH Devanagari Extra" w:cs="BRH Devanagari Extra"/>
+                <w:color w:val="000000"/>
+                <w:sz w:val="32"/>
+                <w:szCs w:val="40"/>
+              </w:rPr>
+              <w:tab/>
+            </w:r>
+            <w:r>
+              <w:rPr>
+                <w:rFonts w:cs="BRH Devanagari Extra"/>
+                <w:color w:val="000000"/>
+                <w:szCs w:val="40"/>
+              </w:rPr>
+              <w:t>1</w:t>
+            </w:r>
+            <w:r>
+              <w:rPr>
+                <w:rFonts w:ascii="BRH Devanagari Extra" w:hAnsi="BRH Devanagari Extra" w:cs="BRH Devanagari Extra"/>
+                <w:color w:val="000000"/>
+                <w:sz w:val="32"/>
+                <w:szCs w:val="40"/>
+              </w:rPr>
+              <w:t>.</w:t>
+            </w:r>
+            <w:r>
+              <w:rPr>
+                <w:rFonts w:cs="BRH Devanagari Extra"/>
+                <w:color w:val="000000"/>
+                <w:szCs w:val="40"/>
+              </w:rPr>
+              <w:t>1</w:t>
+            </w:r>
+            <w:r>
+              <w:rPr>
+                <w:rFonts w:ascii="BRH Devanagari Extra" w:hAnsi="BRH Devanagari Extra" w:cs="BRH Devanagari Extra"/>
+                <w:color w:val="000000"/>
+                <w:sz w:val="32"/>
+                <w:szCs w:val="40"/>
+              </w:rPr>
+              <w:t>.</w:t>
+            </w:r>
+            <w:r>
+              <w:rPr>
+                <w:rFonts w:cs="BRH Devanagari Extra"/>
+                <w:color w:val="000000"/>
+                <w:szCs w:val="40"/>
+              </w:rPr>
+              <w:t>6</w:t>
+            </w:r>
+            <w:r>
+              <w:rPr>
+                <w:rFonts w:ascii="BRH Devanagari Extra" w:hAnsi="BRH Devanagari Extra" w:cs="BRH Devanagari Extra"/>
+                <w:color w:val="000000"/>
+                <w:sz w:val="32"/>
+                <w:szCs w:val="40"/>
+              </w:rPr>
+              <w:t>.</w:t>
+            </w:r>
+            <w:r>
+              <w:rPr>
+                <w:rFonts w:cs="BRH Devanagari Extra"/>
+                <w:color w:val="000000"/>
+                <w:szCs w:val="40"/>
+              </w:rPr>
+              <w:t>1</w:t>
+            </w:r>
+            <w:r>
+              <w:rPr>
+                <w:rFonts w:ascii="BRH Devanagari Extra" w:hAnsi="BRH Devanagari Extra" w:cs="BRH Devanagari Extra"/>
+                <w:color w:val="000000"/>
+                <w:sz w:val="32"/>
+                <w:szCs w:val="40"/>
+              </w:rPr>
+              <w:t>(</w:t>
+            </w:r>
+            <w:r>
+              <w:rPr>
+                <w:rFonts w:cs="BRH Devanagari Extra"/>
+                <w:color w:val="000000"/>
+                <w:szCs w:val="40"/>
+              </w:rPr>
+              <w:t>51</w:t>
+            </w:r>
+            <w:r>
+              <w:rPr>
+                <w:rFonts w:ascii="BRH Devanagari Extra" w:hAnsi="BRH Devanagari Extra" w:cs="BRH Devanagari Extra"/>
+                <w:color w:val="000000"/>
+                <w:sz w:val="32"/>
+                <w:szCs w:val="40"/>
+              </w:rPr>
+              <w:t>)- A</w:t>
+            </w:r>
+            <w:r>
+              <w:rPr>
+                <w:rFonts w:ascii="BRH Malayalam Extra" w:hAnsi="BRH Malayalam Extra" w:cs="BRH Devanagari Extra"/>
+                <w:color w:val="000000"/>
+                <w:szCs w:val="40"/>
+              </w:rPr>
+              <w:t>–</w:t>
+            </w:r>
+            <w:r>
+              <w:rPr>
+                <w:rFonts w:ascii="BRH Devanagari Extra" w:hAnsi="BRH Devanagari Extra" w:cs="BRH Devanagari Extra"/>
+                <w:color w:val="000000"/>
+                <w:sz w:val="32"/>
+                <w:szCs w:val="40"/>
+              </w:rPr>
+              <w:t>mÉÉ</w:t>
+            </w:r>
+            <w:r>
+              <w:rPr>
+                <w:rFonts w:ascii="BRH Malayalam Extra" w:hAnsi="BRH Malayalam Extra" w:cs="BRH Devanagari Extra"/>
+                <w:color w:val="000000"/>
+                <w:szCs w:val="40"/>
+              </w:rPr>
+              <w:t>–</w:t>
+            </w:r>
+            <w:r>
+              <w:rPr>
+                <w:rFonts w:ascii="BRH Devanagari Extra" w:hAnsi="BRH Devanagari Extra" w:cs="BRH Devanagari Extra"/>
+                <w:color w:val="000000"/>
+                <w:sz w:val="32"/>
+                <w:szCs w:val="40"/>
+              </w:rPr>
+              <w:t>lÉÉrÉþ |</w:t>
+            </w:r>
+          </w:p>
+          <w:p>
+            <w:pPr>
+              <w:widowControl w:val="0"/>
+              <w:autoSpaceDE w:val="0"/>
+              <w:autoSpaceDN w:val="0"/>
+              <w:adjustRightInd w:val="0"/>
+              <w:rPr>
+                <w:rFonts w:cs="BRH Malayalam Extra"/>
+                <w:color w:val="000000"/>
+                <w:szCs w:val="40"/>
+              </w:rPr>
+            </w:pPr>
+            <w:r>
+              <w:rPr>
+                <w:rFonts w:ascii="BRH Devanagari Extra" w:hAnsi="BRH Devanagari Extra" w:cs="BRH Devanagari Extra"/>
+                <w:color w:val="000000"/>
+                <w:sz w:val="32"/>
+                <w:szCs w:val="40"/>
+              </w:rPr>
+              <w:t>A</w:t>
+            </w:r>
+            <w:r>
+              <w:rPr>
+                <w:rFonts w:ascii="BRH Malayalam Extra" w:hAnsi="BRH Malayalam Extra" w:cs="BRH Devanagari Extra"/>
+                <w:color w:val="000000"/>
+                <w:szCs w:val="40"/>
+              </w:rPr>
+              <w:t>–</w:t>
+            </w:r>
+            <w:r>
+              <w:rPr>
+                <w:rFonts w:ascii="BRH Devanagari Extra" w:hAnsi="BRH Devanagari Extra" w:cs="BRH Devanagari Extra"/>
+                <w:color w:val="000000"/>
+                <w:sz w:val="32"/>
+                <w:szCs w:val="40"/>
+              </w:rPr>
+              <w:t>mÉÉ</w:t>
+            </w:r>
+            <w:r>
+              <w:rPr>
+                <w:rFonts w:ascii="BRH Malayalam Extra" w:hAnsi="BRH Malayalam Extra" w:cs="BRH Devanagari Extra"/>
+                <w:color w:val="000000"/>
+                <w:szCs w:val="40"/>
+              </w:rPr>
+              <w:t>–</w:t>
+            </w:r>
+            <w:r>
+              <w:rPr>
+                <w:rFonts w:ascii="BRH Devanagari Extra" w:hAnsi="BRH Devanagari Extra" w:cs="BRH Devanagari Extra"/>
+                <w:color w:val="000000"/>
+                <w:sz w:val="32"/>
+                <w:szCs w:val="40"/>
+              </w:rPr>
+              <w:t>lÉÉ</w:t>
+            </w:r>
+            <w:r>
+              <w:rPr>
+                <w:rFonts w:ascii="BRH Devanagari Extra" w:hAnsi="BRH Devanagari Extra" w:cs="BRH Devanagari Extra"/>
+                <w:color w:val="000000"/>
+                <w:sz w:val="32"/>
+                <w:szCs w:val="40"/>
+                <w:highlight w:val="green"/>
+              </w:rPr>
+              <w:t>rÉåirÉ</w:t>
+            </w:r>
+            <w:r>
+              <w:rPr>
+                <w:rFonts w:ascii="BRH Devanagari Extra" w:hAnsi="BRH Devanagari Extra" w:cs="BRH Devanagari Extra"/>
+                <w:color w:val="000000"/>
+                <w:sz w:val="32"/>
+                <w:szCs w:val="40"/>
+                <w:highlight w:val="yellow"/>
+              </w:rPr>
+              <w:t>þ</w:t>
+            </w:r>
+            <w:r>
+              <w:rPr>
+                <w:rFonts w:ascii="BRH Devanagari Extra" w:hAnsi="BRH Devanagari Extra" w:cs="BRH Devanagari Extra"/>
+                <w:color w:val="000000"/>
+                <w:sz w:val="32"/>
+                <w:szCs w:val="40"/>
+              </w:rPr>
+              <w:t>mÉ - A</w:t>
+            </w:r>
+            <w:r>
+              <w:rPr>
+                <w:rFonts w:ascii="BRH Malayalam Extra" w:hAnsi="BRH Malayalam Extra" w:cs="BRH Devanagari Extra"/>
+                <w:color w:val="000000"/>
+                <w:szCs w:val="40"/>
+              </w:rPr>
+              <w:t>–</w:t>
+            </w:r>
+            <w:r>
+              <w:rPr>
+                <w:rFonts w:ascii="BRH Devanagari Extra" w:hAnsi="BRH Devanagari Extra" w:cs="BRH Devanagari Extra"/>
+                <w:color w:val="000000"/>
+                <w:sz w:val="32"/>
+                <w:szCs w:val="40"/>
+              </w:rPr>
+              <w:t xml:space="preserve">lÉÉrÉþ | </w:t>
+            </w:r>
+          </w:p>
+        </w:tc>
+      </w:tr>
+      <w:tr>
+        <w:trPr>
           <w:trHeight w:val="2600"/>
         </w:trPr>
         <w:tc>
@@ -2534,6 +3050,3819 @@
               </w:rPr>
               <w:t xml:space="preserve">uÉxuÉÏþ cÉ | </w:t>
             </w:r>
+          </w:p>
+        </w:tc>
+      </w:tr>
+      <w:tr>
+        <w:trPr>
+          <w:trHeight w:val="2600"/>
+        </w:trPr>
+        <w:tc>
+          <w:tcPr>
+            <w:tcW w:w="6408" w:type="dxa"/>
+          </w:tcPr>
+          <w:p>
+            <w:pPr>
+              <w:widowControl w:val="0"/>
+              <w:autoSpaceDE w:val="0"/>
+              <w:autoSpaceDN w:val="0"/>
+              <w:adjustRightInd w:val="0"/>
+              <w:rPr>
+                <w:rFonts w:ascii="BRH Devanagari Extra" w:hAnsi="BRH Devanagari Extra" w:cs="BRH Devanagari Extra"/>
+                <w:color w:val="000000"/>
+                <w:sz w:val="32"/>
+                <w:szCs w:val="40"/>
+              </w:rPr>
+            </w:pPr>
+            <w:r>
+              <w:rPr>
+                <w:rFonts w:cs="BRH Devanagari Extra"/>
+                <w:color w:val="000000"/>
+                <w:szCs w:val="40"/>
+              </w:rPr>
+              <w:lastRenderedPageBreak/>
+              <w:t>35</w:t>
+            </w:r>
+            <w:r>
+              <w:rPr>
+                <w:rFonts w:ascii="BRH Devanagari Extra" w:hAnsi="BRH Devanagari Extra" w:cs="BRH Devanagari Extra"/>
+                <w:color w:val="000000"/>
+                <w:sz w:val="32"/>
+                <w:szCs w:val="40"/>
+              </w:rPr>
+              <w:t>)</w:t>
+            </w:r>
+            <w:r>
+              <w:rPr>
+                <w:rFonts w:ascii="BRH Devanagari Extra" w:hAnsi="BRH Devanagari Extra" w:cs="BRH Devanagari Extra"/>
+                <w:color w:val="000000"/>
+                <w:sz w:val="32"/>
+                <w:szCs w:val="40"/>
+              </w:rPr>
+              <w:tab/>
+            </w:r>
+            <w:r>
+              <w:rPr>
+                <w:rFonts w:cs="BRH Devanagari Extra"/>
+                <w:color w:val="000000"/>
+                <w:szCs w:val="40"/>
+              </w:rPr>
+              <w:t>1</w:t>
+            </w:r>
+            <w:r>
+              <w:rPr>
+                <w:rFonts w:ascii="BRH Devanagari Extra" w:hAnsi="BRH Devanagari Extra" w:cs="BRH Devanagari Extra"/>
+                <w:color w:val="000000"/>
+                <w:sz w:val="32"/>
+                <w:szCs w:val="40"/>
+              </w:rPr>
+              <w:t>.</w:t>
+            </w:r>
+            <w:r>
+              <w:rPr>
+                <w:rFonts w:cs="BRH Devanagari Extra"/>
+                <w:color w:val="000000"/>
+                <w:szCs w:val="40"/>
+              </w:rPr>
+              <w:t>1</w:t>
+            </w:r>
+            <w:r>
+              <w:rPr>
+                <w:rFonts w:ascii="BRH Devanagari Extra" w:hAnsi="BRH Devanagari Extra" w:cs="BRH Devanagari Extra"/>
+                <w:color w:val="000000"/>
+                <w:sz w:val="32"/>
+                <w:szCs w:val="40"/>
+              </w:rPr>
+              <w:t>.</w:t>
+            </w:r>
+            <w:r>
+              <w:rPr>
+                <w:rFonts w:cs="BRH Devanagari Extra"/>
+                <w:color w:val="000000"/>
+                <w:szCs w:val="40"/>
+              </w:rPr>
+              <w:t>14</w:t>
+            </w:r>
+            <w:r>
+              <w:rPr>
+                <w:rFonts w:ascii="BRH Devanagari Extra" w:hAnsi="BRH Devanagari Extra" w:cs="BRH Devanagari Extra"/>
+                <w:color w:val="000000"/>
+                <w:sz w:val="32"/>
+                <w:szCs w:val="40"/>
+              </w:rPr>
+              <w:t>.</w:t>
+            </w:r>
+            <w:r>
+              <w:rPr>
+                <w:rFonts w:cs="BRH Devanagari Extra"/>
+                <w:color w:val="000000"/>
+                <w:szCs w:val="40"/>
+              </w:rPr>
+              <w:t>2</w:t>
+            </w:r>
+            <w:r>
+              <w:rPr>
+                <w:rFonts w:ascii="BRH Devanagari Extra" w:hAnsi="BRH Devanagari Extra" w:cs="BRH Devanagari Extra"/>
+                <w:color w:val="000000"/>
+                <w:sz w:val="32"/>
+                <w:szCs w:val="40"/>
+              </w:rPr>
+              <w:t>(</w:t>
+            </w:r>
+            <w:r>
+              <w:rPr>
+                <w:rFonts w:cs="BRH Devanagari Extra"/>
+                <w:color w:val="000000"/>
+                <w:szCs w:val="40"/>
+              </w:rPr>
+              <w:t>32</w:t>
+            </w:r>
+            <w:r>
+              <w:rPr>
+                <w:rFonts w:ascii="BRH Devanagari Extra" w:hAnsi="BRH Devanagari Extra" w:cs="BRH Devanagari Extra"/>
+                <w:color w:val="000000"/>
+                <w:sz w:val="32"/>
+                <w:szCs w:val="40"/>
+              </w:rPr>
+              <w:t>)- UÉ</w:t>
+            </w:r>
+            <w:r>
+              <w:rPr>
+                <w:rFonts w:ascii="BRH Malayalam Extra" w:hAnsi="BRH Malayalam Extra" w:cs="BRH Devanagari Extra"/>
+                <w:color w:val="000000"/>
+                <w:szCs w:val="40"/>
+              </w:rPr>
+              <w:t>–</w:t>
+            </w:r>
+            <w:r>
+              <w:rPr>
+                <w:rFonts w:ascii="BRH Devanagari Extra" w:hAnsi="BRH Devanagari Extra" w:cs="BRH Devanagari Extra"/>
+                <w:color w:val="000000"/>
+                <w:sz w:val="32"/>
+                <w:szCs w:val="40"/>
+              </w:rPr>
+              <w:t>xÉ</w:t>
+            </w:r>
+            <w:r>
+              <w:rPr>
+                <w:rFonts w:ascii="BRH Malayalam Extra" w:hAnsi="BRH Malayalam Extra" w:cs="BRH Devanagari Extra"/>
+                <w:color w:val="000000"/>
+                <w:szCs w:val="40"/>
+              </w:rPr>
+              <w:t>–</w:t>
+            </w:r>
+            <w:r>
+              <w:rPr>
+                <w:rFonts w:ascii="BRH Devanagari Extra" w:hAnsi="BRH Devanagari Extra" w:cs="BRH Devanagari Extra"/>
+                <w:color w:val="000000"/>
+                <w:sz w:val="32"/>
+                <w:szCs w:val="40"/>
+              </w:rPr>
+              <w:t>iÉç | zÉÑ</w:t>
+            </w:r>
+            <w:r>
+              <w:rPr>
+                <w:rFonts w:ascii="BRH Malayalam Extra" w:hAnsi="BRH Malayalam Extra" w:cs="BRH Devanagari Extra"/>
+                <w:color w:val="000000"/>
+                <w:szCs w:val="40"/>
+              </w:rPr>
+              <w:t>–</w:t>
+            </w:r>
+            <w:r>
+              <w:rPr>
+                <w:rFonts w:ascii="BRH Devanagari Extra" w:hAnsi="BRH Devanagari Extra" w:cs="BRH Devanagari Extra"/>
+                <w:color w:val="000000"/>
+                <w:sz w:val="32"/>
+                <w:szCs w:val="40"/>
+              </w:rPr>
+              <w:t>ÂkÉþÈ | cÉ</w:t>
+            </w:r>
+            <w:r>
+              <w:rPr>
+                <w:rFonts w:ascii="BRH Malayalam Extra" w:hAnsi="BRH Malayalam Extra" w:cs="BRH Devanagari Extra"/>
+                <w:color w:val="000000"/>
+                <w:szCs w:val="40"/>
+              </w:rPr>
+              <w:t>–</w:t>
+            </w:r>
+            <w:r>
+              <w:rPr>
+                <w:rFonts w:ascii="BRH Devanagari Extra" w:hAnsi="BRH Devanagari Extra" w:cs="BRH Devanagari Extra"/>
+                <w:color w:val="000000"/>
+                <w:sz w:val="32"/>
+                <w:szCs w:val="40"/>
+                <w:highlight w:val="yellow"/>
+              </w:rPr>
+              <w:t>lSìÉÿaÉëÉ</w:t>
+            </w:r>
+            <w:r>
+              <w:rPr>
+                <w:rFonts w:ascii="BRH Devanagari Extra" w:hAnsi="BRH Devanagari Extra" w:cs="BRH Devanagari Extra"/>
+                <w:color w:val="000000"/>
+                <w:sz w:val="32"/>
+                <w:szCs w:val="40"/>
+              </w:rPr>
+              <w:t>È |</w:t>
+            </w:r>
+          </w:p>
+          <w:p>
+            <w:pPr>
+              <w:widowControl w:val="0"/>
+              <w:autoSpaceDE w:val="0"/>
+              <w:autoSpaceDN w:val="0"/>
+              <w:adjustRightInd w:val="0"/>
+              <w:rPr>
+                <w:rFonts w:ascii="BRH Devanagari Extra" w:hAnsi="BRH Devanagari Extra" w:cs="BRH Devanagari Extra"/>
+                <w:color w:val="000000"/>
+                <w:sz w:val="32"/>
+                <w:szCs w:val="40"/>
+              </w:rPr>
+            </w:pPr>
+            <w:r>
+              <w:rPr>
+                <w:rFonts w:ascii="BRH Devanagari Extra" w:hAnsi="BRH Devanagari Extra" w:cs="BRH Devanagari Extra"/>
+                <w:color w:val="000000"/>
+                <w:sz w:val="32"/>
+                <w:szCs w:val="40"/>
+              </w:rPr>
+              <w:t>UÉ</w:t>
+            </w:r>
+            <w:r>
+              <w:rPr>
+                <w:rFonts w:ascii="BRH Malayalam Extra" w:hAnsi="BRH Malayalam Extra" w:cs="BRH Devanagari Extra"/>
+                <w:color w:val="000000"/>
+                <w:szCs w:val="40"/>
+              </w:rPr>
+              <w:t>–</w:t>
+            </w:r>
+            <w:r>
+              <w:rPr>
+                <w:rFonts w:ascii="BRH Devanagari Extra" w:hAnsi="BRH Devanagari Extra" w:cs="BRH Devanagari Extra"/>
+                <w:color w:val="000000"/>
+                <w:sz w:val="32"/>
+                <w:szCs w:val="40"/>
+              </w:rPr>
+              <w:t>xÉ</w:t>
+            </w:r>
+            <w:r>
+              <w:rPr>
+                <w:rFonts w:ascii="BRH Devanagari Extra" w:hAnsi="BRH Devanagari Extra" w:cs="BRH Devanagari Extra"/>
+                <w:color w:val="000000"/>
+                <w:sz w:val="32"/>
+                <w:szCs w:val="40"/>
+              </w:rPr>
+              <w:t xml:space="preserve"> </w:t>
+            </w:r>
+            <w:r>
+              <w:rPr>
+                <w:rFonts w:ascii="BRH Malayalam Extra" w:hAnsi="BRH Malayalam Extra" w:cs="BRH Devanagari Extra"/>
+                <w:color w:val="000000"/>
+                <w:szCs w:val="40"/>
+              </w:rPr>
+              <w:t>–</w:t>
+            </w:r>
+            <w:r>
+              <w:rPr>
+                <w:rFonts w:ascii="BRH Devanagari Extra" w:hAnsi="BRH Devanagari Extra" w:cs="BRH Devanagari Extra"/>
+                <w:color w:val="000000"/>
+                <w:sz w:val="32"/>
+                <w:szCs w:val="40"/>
+              </w:rPr>
+              <w:t>cNÒû</w:t>
+            </w:r>
+            <w:r>
+              <w:rPr>
+                <w:rFonts w:ascii="BRH Malayalam Extra" w:hAnsi="BRH Malayalam Extra" w:cs="BRH Devanagari Extra"/>
+                <w:color w:val="000000"/>
+                <w:szCs w:val="40"/>
+              </w:rPr>
+              <w:t>–</w:t>
+            </w:r>
+            <w:r>
+              <w:rPr>
+                <w:rFonts w:ascii="BRH Devanagari Extra" w:hAnsi="BRH Devanagari Extra" w:cs="BRH Devanagari Extra"/>
+                <w:color w:val="000000"/>
+                <w:sz w:val="32"/>
+                <w:szCs w:val="40"/>
+              </w:rPr>
+              <w:t>ÂkÉþÈ zÉÑ</w:t>
+            </w:r>
+            <w:r>
+              <w:rPr>
+                <w:rFonts w:ascii="BRH Malayalam Extra" w:hAnsi="BRH Malayalam Extra" w:cs="BRH Devanagari Extra"/>
+                <w:color w:val="000000"/>
+                <w:szCs w:val="40"/>
+              </w:rPr>
+              <w:t>–</w:t>
+            </w:r>
+            <w:r>
+              <w:rPr>
+                <w:rFonts w:ascii="BRH Devanagari Extra" w:hAnsi="BRH Devanagari Extra" w:cs="BRH Devanagari Extra"/>
+                <w:color w:val="000000"/>
+                <w:sz w:val="32"/>
+                <w:szCs w:val="40"/>
+              </w:rPr>
+              <w:t xml:space="preserve">ÂkÉÉåþ UÉxÉSè </w:t>
+            </w:r>
+            <w:r>
+              <w:rPr>
+                <w:rFonts w:ascii="BRH Devanagari Extra" w:hAnsi="BRH Devanagari Extra" w:cs="BRH Devanagari Extra"/>
+                <w:color w:val="000000"/>
+                <w:sz w:val="32"/>
+                <w:szCs w:val="40"/>
+              </w:rPr>
+              <w:t>UÉxÉ</w:t>
+            </w:r>
+            <w:r>
+              <w:rPr>
+                <w:rFonts w:ascii="BRH Devanagari Extra" w:hAnsi="BRH Devanagari Extra" w:cs="BRH Devanagari Extra"/>
+                <w:color w:val="000000"/>
+                <w:sz w:val="32"/>
+                <w:szCs w:val="40"/>
+              </w:rPr>
+              <w:t xml:space="preserve"> cNÒû</w:t>
+            </w:r>
+            <w:r>
+              <w:rPr>
+                <w:rFonts w:ascii="BRH Malayalam Extra" w:hAnsi="BRH Malayalam Extra" w:cs="BRH Devanagari Extra"/>
+                <w:color w:val="000000"/>
+                <w:szCs w:val="40"/>
+              </w:rPr>
+              <w:t>–</w:t>
+            </w:r>
+            <w:r>
+              <w:rPr>
+                <w:rFonts w:ascii="BRH Devanagari Extra" w:hAnsi="BRH Devanagari Extra" w:cs="BRH Devanagari Extra"/>
+                <w:color w:val="000000"/>
+                <w:sz w:val="32"/>
+                <w:szCs w:val="40"/>
+              </w:rPr>
+              <w:t xml:space="preserve">ÂkÉþ </w:t>
+            </w:r>
+            <w:r>
+              <w:rPr>
+                <w:rFonts w:ascii="BRH Devanagari Extra" w:hAnsi="BRH Devanagari Extra" w:cs="BRH Devanagari Extra"/>
+                <w:color w:val="000000"/>
+                <w:sz w:val="32"/>
+                <w:szCs w:val="40"/>
+                <w:highlight w:val="yellow"/>
+              </w:rPr>
+              <w:t>b¶É</w:t>
+            </w:r>
+            <w:r>
+              <w:rPr>
+                <w:rFonts w:ascii="BRH Malayalam Extra" w:hAnsi="BRH Malayalam Extra" w:cs="BRH Devanagari Extra"/>
+                <w:color w:val="000000"/>
+                <w:szCs w:val="40"/>
+                <w:highlight w:val="yellow"/>
+              </w:rPr>
+              <w:t>–</w:t>
+            </w:r>
+            <w:r>
+              <w:rPr>
+                <w:rFonts w:ascii="BRH Devanagari Extra" w:hAnsi="BRH Devanagari Extra" w:cs="BRH Devanagari Extra"/>
+                <w:color w:val="000000"/>
+                <w:sz w:val="32"/>
+                <w:szCs w:val="40"/>
+                <w:highlight w:val="yellow"/>
+              </w:rPr>
+              <w:t>lSìÉÿaÉëÉ</w:t>
+            </w:r>
+            <w:r>
+              <w:rPr>
+                <w:rFonts w:ascii="BRH Devanagari Extra" w:hAnsi="BRH Devanagari Extra" w:cs="BRH Devanagari Extra"/>
+                <w:color w:val="000000"/>
+                <w:sz w:val="32"/>
+                <w:szCs w:val="40"/>
+              </w:rPr>
+              <w:t xml:space="preserve"> </w:t>
+            </w:r>
+          </w:p>
+          <w:p>
+            <w:pPr>
+              <w:widowControl w:val="0"/>
+              <w:autoSpaceDE w:val="0"/>
+              <w:autoSpaceDN w:val="0"/>
+              <w:adjustRightInd w:val="0"/>
+              <w:rPr>
+                <w:rFonts w:ascii="BRH Devanagari Extra" w:hAnsi="BRH Devanagari Extra" w:cs="BRH Devanagari Extra"/>
+                <w:color w:val="000000"/>
+                <w:sz w:val="32"/>
+                <w:szCs w:val="40"/>
+              </w:rPr>
+            </w:pPr>
+            <w:r>
+              <w:rPr>
+                <w:rFonts w:ascii="BRH Devanagari Extra" w:hAnsi="BRH Devanagari Extra" w:cs="BRH Devanagari Extra"/>
+                <w:color w:val="000000"/>
+                <w:sz w:val="32"/>
+                <w:szCs w:val="40"/>
+                <w:highlight w:val="yellow"/>
+              </w:rPr>
+              <w:t>b¶É</w:t>
+            </w:r>
+            <w:r>
+              <w:rPr>
+                <w:rFonts w:ascii="BRH Malayalam Extra" w:hAnsi="BRH Malayalam Extra" w:cs="BRH Devanagari Extra"/>
+                <w:color w:val="000000"/>
+                <w:szCs w:val="40"/>
+                <w:highlight w:val="yellow"/>
+              </w:rPr>
+              <w:t>–</w:t>
+            </w:r>
+            <w:r>
+              <w:rPr>
+                <w:rFonts w:ascii="BRH Devanagari Extra" w:hAnsi="BRH Devanagari Extra" w:cs="BRH Devanagari Extra"/>
+                <w:color w:val="000000"/>
+                <w:sz w:val="32"/>
+                <w:szCs w:val="40"/>
+                <w:highlight w:val="yellow"/>
+              </w:rPr>
+              <w:t>lSìÉÿaÉëÉÈ</w:t>
+            </w:r>
+            <w:r>
+              <w:rPr>
+                <w:rFonts w:ascii="BRH Devanagari Extra" w:hAnsi="BRH Devanagari Extra" w:cs="BRH Devanagari Extra"/>
+                <w:color w:val="000000"/>
+                <w:sz w:val="32"/>
+                <w:szCs w:val="40"/>
+              </w:rPr>
+              <w:t xml:space="preserve"> zÉÑ</w:t>
+            </w:r>
+            <w:r>
+              <w:rPr>
+                <w:rFonts w:ascii="BRH Malayalam Extra" w:hAnsi="BRH Malayalam Extra" w:cs="BRH Devanagari Extra"/>
+                <w:color w:val="000000"/>
+                <w:szCs w:val="40"/>
+              </w:rPr>
+              <w:t>–</w:t>
+            </w:r>
+            <w:r>
+              <w:rPr>
+                <w:rFonts w:ascii="BRH Devanagari Extra" w:hAnsi="BRH Devanagari Extra" w:cs="BRH Devanagari Extra"/>
+                <w:color w:val="000000"/>
+                <w:sz w:val="32"/>
+                <w:szCs w:val="40"/>
+              </w:rPr>
+              <w:t>ÂkÉÉåþ UÉxÉSè UÉxÉcNÒû</w:t>
+            </w:r>
+            <w:r>
+              <w:rPr>
+                <w:rFonts w:ascii="BRH Malayalam Extra" w:hAnsi="BRH Malayalam Extra" w:cs="BRH Devanagari Extra"/>
+                <w:color w:val="000000"/>
+                <w:szCs w:val="40"/>
+              </w:rPr>
+              <w:t>–</w:t>
+            </w:r>
+            <w:r>
+              <w:rPr>
+                <w:rFonts w:ascii="BRH Devanagari Extra" w:hAnsi="BRH Devanagari Extra" w:cs="BRH Devanagari Extra"/>
+                <w:color w:val="000000"/>
+                <w:sz w:val="32"/>
+                <w:szCs w:val="40"/>
+              </w:rPr>
+              <w:t>ÂkÉþ ¶É</w:t>
+            </w:r>
+            <w:r>
+              <w:rPr>
+                <w:rFonts w:ascii="BRH Malayalam Extra" w:hAnsi="BRH Malayalam Extra" w:cs="BRH Devanagari Extra"/>
+                <w:color w:val="000000"/>
+                <w:szCs w:val="40"/>
+              </w:rPr>
+              <w:t>–</w:t>
+            </w:r>
+            <w:r>
+              <w:rPr>
+                <w:rFonts w:ascii="BRH Devanagari Extra" w:hAnsi="BRH Devanagari Extra" w:cs="BRH Devanagari Extra"/>
+                <w:color w:val="000000"/>
+                <w:sz w:val="32"/>
+                <w:szCs w:val="40"/>
+                <w:highlight w:val="yellow"/>
+              </w:rPr>
+              <w:t>lSìÉÿaÉëÉÈ</w:t>
+            </w:r>
+            <w:r>
+              <w:rPr>
+                <w:rFonts w:ascii="BRH Devanagari Extra" w:hAnsi="BRH Devanagari Extra" w:cs="BRH Devanagari Extra"/>
+                <w:color w:val="000000"/>
+                <w:sz w:val="32"/>
+                <w:szCs w:val="40"/>
+              </w:rPr>
+              <w:t xml:space="preserve"> | </w:t>
+            </w:r>
+          </w:p>
+          <w:p>
+            <w:pPr>
+              <w:widowControl w:val="0"/>
+              <w:autoSpaceDE w:val="0"/>
+              <w:autoSpaceDN w:val="0"/>
+              <w:adjustRightInd w:val="0"/>
+              <w:rPr>
+                <w:rFonts w:ascii="BRH Devanagari Extra" w:hAnsi="BRH Devanagari Extra" w:cs="BRH Devanagari Extra"/>
+                <w:color w:val="000000"/>
+                <w:sz w:val="32"/>
+                <w:szCs w:val="40"/>
+              </w:rPr>
+            </w:pPr>
+            <w:r>
+              <w:rPr>
+                <w:rFonts w:cs="BRH Devanagari Extra"/>
+                <w:color w:val="000000"/>
+                <w:szCs w:val="40"/>
+              </w:rPr>
+              <w:t>36</w:t>
+            </w:r>
+            <w:r>
+              <w:rPr>
+                <w:rFonts w:ascii="BRH Devanagari Extra" w:hAnsi="BRH Devanagari Extra" w:cs="BRH Devanagari Extra"/>
+                <w:color w:val="000000"/>
+                <w:sz w:val="32"/>
+                <w:szCs w:val="40"/>
+              </w:rPr>
+              <w:t>)</w:t>
+            </w:r>
+            <w:r>
+              <w:rPr>
+                <w:rFonts w:ascii="BRH Devanagari Extra" w:hAnsi="BRH Devanagari Extra" w:cs="BRH Devanagari Extra"/>
+                <w:color w:val="000000"/>
+                <w:sz w:val="32"/>
+                <w:szCs w:val="40"/>
+              </w:rPr>
+              <w:tab/>
+            </w:r>
+            <w:r>
+              <w:rPr>
+                <w:rFonts w:cs="BRH Devanagari Extra"/>
+                <w:color w:val="000000"/>
+                <w:szCs w:val="40"/>
+              </w:rPr>
+              <w:t>1</w:t>
+            </w:r>
+            <w:r>
+              <w:rPr>
+                <w:rFonts w:ascii="BRH Devanagari Extra" w:hAnsi="BRH Devanagari Extra" w:cs="BRH Devanagari Extra"/>
+                <w:color w:val="000000"/>
+                <w:sz w:val="32"/>
+                <w:szCs w:val="40"/>
+              </w:rPr>
+              <w:t>.</w:t>
+            </w:r>
+            <w:r>
+              <w:rPr>
+                <w:rFonts w:cs="BRH Devanagari Extra"/>
+                <w:color w:val="000000"/>
+                <w:szCs w:val="40"/>
+              </w:rPr>
+              <w:t>1</w:t>
+            </w:r>
+            <w:r>
+              <w:rPr>
+                <w:rFonts w:ascii="BRH Devanagari Extra" w:hAnsi="BRH Devanagari Extra" w:cs="BRH Devanagari Extra"/>
+                <w:color w:val="000000"/>
+                <w:sz w:val="32"/>
+                <w:szCs w:val="40"/>
+              </w:rPr>
+              <w:t>.</w:t>
+            </w:r>
+            <w:r>
+              <w:rPr>
+                <w:rFonts w:cs="BRH Devanagari Extra"/>
+                <w:color w:val="000000"/>
+                <w:szCs w:val="40"/>
+              </w:rPr>
+              <w:t>14</w:t>
+            </w:r>
+            <w:r>
+              <w:rPr>
+                <w:rFonts w:ascii="BRH Devanagari Extra" w:hAnsi="BRH Devanagari Extra" w:cs="BRH Devanagari Extra"/>
+                <w:color w:val="000000"/>
+                <w:sz w:val="32"/>
+                <w:szCs w:val="40"/>
+              </w:rPr>
+              <w:t>.</w:t>
+            </w:r>
+            <w:r>
+              <w:rPr>
+                <w:rFonts w:cs="BRH Devanagari Extra"/>
+                <w:color w:val="000000"/>
+                <w:szCs w:val="40"/>
+              </w:rPr>
+              <w:t>2</w:t>
+            </w:r>
+            <w:r>
+              <w:rPr>
+                <w:rFonts w:ascii="BRH Devanagari Extra" w:hAnsi="BRH Devanagari Extra" w:cs="BRH Devanagari Extra"/>
+                <w:color w:val="000000"/>
+                <w:sz w:val="32"/>
+                <w:szCs w:val="40"/>
+              </w:rPr>
+              <w:t>(</w:t>
+            </w:r>
+            <w:r>
+              <w:rPr>
+                <w:rFonts w:cs="BRH Devanagari Extra"/>
+                <w:color w:val="000000"/>
+                <w:szCs w:val="40"/>
+              </w:rPr>
+              <w:t>33</w:t>
+            </w:r>
+            <w:r>
+              <w:rPr>
+                <w:rFonts w:ascii="BRH Devanagari Extra" w:hAnsi="BRH Devanagari Extra" w:cs="BRH Devanagari Extra"/>
+                <w:color w:val="000000"/>
+                <w:sz w:val="32"/>
+                <w:szCs w:val="40"/>
+              </w:rPr>
+              <w:t>)- zÉÑ</w:t>
+            </w:r>
+            <w:r>
+              <w:rPr>
+                <w:rFonts w:ascii="BRH Malayalam Extra" w:hAnsi="BRH Malayalam Extra" w:cs="BRH Devanagari Extra"/>
+                <w:color w:val="000000"/>
+                <w:szCs w:val="40"/>
+              </w:rPr>
+              <w:t>–</w:t>
+            </w:r>
+            <w:r>
+              <w:rPr>
+                <w:rFonts w:ascii="BRH Devanagari Extra" w:hAnsi="BRH Devanagari Extra" w:cs="BRH Devanagari Extra"/>
+                <w:color w:val="000000"/>
+                <w:sz w:val="32"/>
+                <w:szCs w:val="40"/>
+              </w:rPr>
+              <w:t>ÂkÉþÈ | cÉ</w:t>
+            </w:r>
+            <w:r>
+              <w:rPr>
+                <w:rFonts w:ascii="BRH Malayalam Extra" w:hAnsi="BRH Malayalam Extra" w:cs="BRH Devanagari Extra"/>
+                <w:color w:val="000000"/>
+                <w:szCs w:val="40"/>
+              </w:rPr>
+              <w:t>–</w:t>
+            </w:r>
+            <w:r>
+              <w:rPr>
+                <w:rFonts w:ascii="BRH Devanagari Extra" w:hAnsi="BRH Devanagari Extra" w:cs="BRH Devanagari Extra"/>
+                <w:color w:val="000000"/>
+                <w:sz w:val="32"/>
+                <w:szCs w:val="40"/>
+              </w:rPr>
+              <w:t>l</w:t>
+            </w:r>
+            <w:r>
+              <w:rPr>
+                <w:rFonts w:ascii="BRH Devanagari Extra" w:hAnsi="BRH Devanagari Extra" w:cs="BRH Devanagari Extra"/>
+                <w:color w:val="000000"/>
+                <w:sz w:val="32"/>
+                <w:szCs w:val="40"/>
+                <w:highlight w:val="yellow"/>
+              </w:rPr>
+              <w:t>SìÉÿaÉëÉÈ</w:t>
+            </w:r>
+            <w:r>
+              <w:rPr>
+                <w:rFonts w:ascii="BRH Devanagari Extra" w:hAnsi="BRH Devanagari Extra" w:cs="BRH Devanagari Extra"/>
+                <w:color w:val="000000"/>
+                <w:sz w:val="32"/>
+                <w:szCs w:val="40"/>
+              </w:rPr>
+              <w:t xml:space="preserve"> | ÍkÉrÉþÎlkÉrÉqÉç |</w:t>
+            </w:r>
+          </w:p>
+          <w:p>
+            <w:pPr>
+              <w:widowControl w:val="0"/>
+              <w:autoSpaceDE w:val="0"/>
+              <w:autoSpaceDN w:val="0"/>
+              <w:adjustRightInd w:val="0"/>
+              <w:rPr>
+                <w:rFonts w:ascii="BRH Devanagari Extra" w:hAnsi="BRH Devanagari Extra" w:cs="BRH Devanagari Extra"/>
+                <w:color w:val="000000"/>
+                <w:sz w:val="32"/>
+                <w:szCs w:val="40"/>
+              </w:rPr>
+            </w:pPr>
+            <w:r>
+              <w:rPr>
+                <w:rFonts w:ascii="BRH Devanagari Extra" w:hAnsi="BRH Devanagari Extra" w:cs="BRH Devanagari Extra"/>
+                <w:color w:val="000000"/>
+                <w:sz w:val="32"/>
+                <w:szCs w:val="40"/>
+              </w:rPr>
+              <w:t>zÉÑ</w:t>
+            </w:r>
+            <w:r>
+              <w:rPr>
+                <w:rFonts w:ascii="BRH Malayalam Extra" w:hAnsi="BRH Malayalam Extra" w:cs="BRH Devanagari Extra"/>
+                <w:color w:val="000000"/>
+                <w:szCs w:val="40"/>
+              </w:rPr>
+              <w:t>–</w:t>
+            </w:r>
+            <w:r>
+              <w:rPr>
+                <w:rFonts w:ascii="BRH Devanagari Extra" w:hAnsi="BRH Devanagari Extra" w:cs="BRH Devanagari Extra"/>
+                <w:color w:val="000000"/>
+                <w:sz w:val="32"/>
+                <w:szCs w:val="40"/>
+              </w:rPr>
+              <w:t>ÂkÉþ ¶É</w:t>
+            </w:r>
+            <w:r>
+              <w:rPr>
+                <w:rFonts w:ascii="BRH Malayalam Extra" w:hAnsi="BRH Malayalam Extra" w:cs="BRH Devanagari Extra"/>
+                <w:color w:val="000000"/>
+                <w:szCs w:val="40"/>
+              </w:rPr>
+              <w:t>–</w:t>
+            </w:r>
+            <w:r>
+              <w:rPr>
+                <w:rFonts w:ascii="BRH Devanagari Extra" w:hAnsi="BRH Devanagari Extra" w:cs="BRH Devanagari Extra"/>
+                <w:color w:val="000000"/>
+                <w:sz w:val="32"/>
+                <w:szCs w:val="40"/>
+                <w:highlight w:val="yellow"/>
+              </w:rPr>
+              <w:t>lSìÉÿaÉ</w:t>
+            </w:r>
+            <w:r>
+              <w:rPr>
+                <w:rFonts w:ascii="BRH Devanagari Extra" w:hAnsi="BRH Devanagari Extra" w:cs="BRH Devanagari Extra"/>
+                <w:color w:val="000000"/>
+                <w:sz w:val="32"/>
+                <w:szCs w:val="40"/>
+              </w:rPr>
+              <w:t>ëÉ ¶É</w:t>
+            </w:r>
+            <w:r>
+              <w:rPr>
+                <w:rFonts w:ascii="BRH Malayalam Extra" w:hAnsi="BRH Malayalam Extra" w:cs="BRH Devanagari Extra"/>
+                <w:color w:val="000000"/>
+                <w:szCs w:val="40"/>
+              </w:rPr>
+              <w:t>–</w:t>
+            </w:r>
+            <w:r>
+              <w:rPr>
+                <w:rFonts w:ascii="BRH Devanagari Extra" w:hAnsi="BRH Devanagari Extra" w:cs="BRH Devanagari Extra"/>
+                <w:color w:val="000000"/>
+                <w:sz w:val="32"/>
+                <w:szCs w:val="40"/>
+                <w:highlight w:val="yellow"/>
+              </w:rPr>
+              <w:t>lSìÉÿaÉëÉÈ</w:t>
+            </w:r>
+            <w:r>
+              <w:rPr>
+                <w:rFonts w:ascii="BRH Devanagari Extra" w:hAnsi="BRH Devanagari Extra" w:cs="BRH Devanagari Extra"/>
+                <w:color w:val="000000"/>
+                <w:sz w:val="32"/>
+                <w:szCs w:val="40"/>
+              </w:rPr>
+              <w:t xml:space="preserve"> zÉÑ</w:t>
+            </w:r>
+            <w:r>
+              <w:rPr>
+                <w:rFonts w:ascii="BRH Malayalam Extra" w:hAnsi="BRH Malayalam Extra" w:cs="BRH Devanagari Extra"/>
+                <w:color w:val="000000"/>
+                <w:szCs w:val="40"/>
+              </w:rPr>
+              <w:t>–</w:t>
+            </w:r>
+            <w:r>
+              <w:rPr>
+                <w:rFonts w:ascii="BRH Devanagari Extra" w:hAnsi="BRH Devanagari Extra" w:cs="BRH Devanagari Extra"/>
+                <w:color w:val="000000"/>
+                <w:sz w:val="32"/>
+                <w:szCs w:val="40"/>
+              </w:rPr>
+              <w:t>ÂkÉþÈ zÉÑ</w:t>
+            </w:r>
+            <w:r>
+              <w:rPr>
+                <w:rFonts w:ascii="BRH Malayalam Extra" w:hAnsi="BRH Malayalam Extra" w:cs="BRH Devanagari Extra"/>
+                <w:color w:val="000000"/>
+                <w:szCs w:val="40"/>
+              </w:rPr>
+              <w:t>–</w:t>
+            </w:r>
+            <w:r>
+              <w:rPr>
+                <w:rFonts w:ascii="BRH Devanagari Extra" w:hAnsi="BRH Devanagari Extra" w:cs="BRH Devanagari Extra"/>
+                <w:color w:val="000000"/>
+                <w:sz w:val="32"/>
+                <w:szCs w:val="40"/>
+              </w:rPr>
+              <w:t>ÂkÉþ ¶É</w:t>
+            </w:r>
+            <w:r>
+              <w:rPr>
+                <w:rFonts w:ascii="BRH Malayalam Extra" w:hAnsi="BRH Malayalam Extra" w:cs="BRH Devanagari Extra"/>
+                <w:color w:val="000000"/>
+                <w:szCs w:val="40"/>
+              </w:rPr>
+              <w:t>–</w:t>
+            </w:r>
+            <w:r>
+              <w:rPr>
+                <w:rFonts w:ascii="BRH Devanagari Extra" w:hAnsi="BRH Devanagari Extra" w:cs="BRH Devanagari Extra"/>
+                <w:color w:val="000000"/>
+                <w:sz w:val="32"/>
+                <w:szCs w:val="40"/>
+                <w:highlight w:val="yellow"/>
+              </w:rPr>
+              <w:t>lSìÉ</w:t>
+            </w:r>
+            <w:r>
+              <w:rPr>
+                <w:rFonts w:ascii="BRH Devanagari Extra" w:hAnsi="BRH Devanagari Extra" w:cs="BRH Devanagari Extra"/>
+                <w:color w:val="000000"/>
+                <w:sz w:val="32"/>
+                <w:szCs w:val="40"/>
+              </w:rPr>
+              <w:t>ÿaÉëÉ</w:t>
+            </w:r>
+            <w:r>
+              <w:rPr>
+                <w:rFonts w:ascii="BRH Malayalam Extra" w:hAnsi="BRH Malayalam Extra" w:cs="BRH Devanagari Extra"/>
+                <w:color w:val="000000"/>
+                <w:szCs w:val="40"/>
+              </w:rPr>
+              <w:t>–</w:t>
+            </w:r>
+            <w:r>
+              <w:rPr>
+                <w:rFonts w:ascii="BRH Devanagari Extra" w:hAnsi="BRH Devanagari Extra" w:cs="BRH Devanagari Extra"/>
+                <w:color w:val="000000"/>
+                <w:sz w:val="32"/>
+                <w:szCs w:val="40"/>
+              </w:rPr>
+              <w:t xml:space="preserve"> ÍkÉrÉþÎlkÉrÉ</w:t>
+            </w:r>
+            <w:r>
+              <w:rPr>
+                <w:rFonts w:ascii="BRH Malayalam Extra" w:hAnsi="BRH Malayalam Extra" w:cs="BRH Devanagari Extra"/>
+                <w:color w:val="000000"/>
+                <w:szCs w:val="40"/>
+              </w:rPr>
+              <w:t>–</w:t>
+            </w:r>
+            <w:r>
+              <w:rPr>
+                <w:rFonts w:ascii="BRH Devanagari Extra" w:hAnsi="BRH Devanagari Extra" w:cs="BRH Devanagari Extra"/>
+                <w:color w:val="000000"/>
+                <w:sz w:val="32"/>
+                <w:szCs w:val="40"/>
+              </w:rPr>
+              <w:t>qÉç ÍkÉrÉþÎlkÉrÉqÉç cÉ</w:t>
+            </w:r>
+            <w:r>
+              <w:rPr>
+                <w:rFonts w:ascii="BRH Malayalam Extra" w:hAnsi="BRH Malayalam Extra" w:cs="BRH Devanagari Extra"/>
+                <w:color w:val="000000"/>
+                <w:szCs w:val="40"/>
+              </w:rPr>
+              <w:t>–</w:t>
+            </w:r>
+            <w:r>
+              <w:rPr>
+                <w:rFonts w:ascii="BRH Devanagari Extra" w:hAnsi="BRH Devanagari Extra" w:cs="BRH Devanagari Extra"/>
+                <w:color w:val="000000"/>
+                <w:sz w:val="32"/>
+                <w:szCs w:val="40"/>
+                <w:highlight w:val="yellow"/>
+              </w:rPr>
+              <w:t>lSìÉÿaÉëÉÈ</w:t>
+            </w:r>
+            <w:r>
+              <w:rPr>
+                <w:rFonts w:ascii="BRH Devanagari Extra" w:hAnsi="BRH Devanagari Extra" w:cs="BRH Devanagari Extra"/>
+                <w:color w:val="000000"/>
+                <w:sz w:val="32"/>
+                <w:szCs w:val="40"/>
+              </w:rPr>
+              <w:t xml:space="preserve"> zÉÑ</w:t>
+            </w:r>
+            <w:r>
+              <w:rPr>
+                <w:rFonts w:ascii="BRH Malayalam Extra" w:hAnsi="BRH Malayalam Extra" w:cs="BRH Devanagari Extra"/>
+                <w:color w:val="000000"/>
+                <w:szCs w:val="40"/>
+              </w:rPr>
+              <w:t>–</w:t>
+            </w:r>
+            <w:r>
+              <w:rPr>
+                <w:rFonts w:ascii="BRH Devanagari Extra" w:hAnsi="BRH Devanagari Extra" w:cs="BRH Devanagari Extra"/>
+                <w:color w:val="000000"/>
+                <w:sz w:val="32"/>
+                <w:szCs w:val="40"/>
+              </w:rPr>
+              <w:t>ÂkÉþÈ zÉÑ</w:t>
+            </w:r>
+            <w:r>
+              <w:rPr>
+                <w:rFonts w:ascii="BRH Malayalam Extra" w:hAnsi="BRH Malayalam Extra" w:cs="BRH Devanagari Extra"/>
+                <w:color w:val="000000"/>
+                <w:szCs w:val="40"/>
+              </w:rPr>
+              <w:t>–</w:t>
+            </w:r>
+            <w:r>
+              <w:rPr>
+                <w:rFonts w:ascii="BRH Devanagari Extra" w:hAnsi="BRH Devanagari Extra" w:cs="BRH Devanagari Extra"/>
+                <w:color w:val="000000"/>
+                <w:sz w:val="32"/>
+                <w:szCs w:val="40"/>
+              </w:rPr>
+              <w:t xml:space="preserve">ÂkÉþ </w:t>
+            </w:r>
+          </w:p>
+          <w:p>
+            <w:pPr>
+              <w:widowControl w:val="0"/>
+              <w:autoSpaceDE w:val="0"/>
+              <w:autoSpaceDN w:val="0"/>
+              <w:adjustRightInd w:val="0"/>
+              <w:rPr>
+                <w:rFonts w:ascii="BRH Devanagari Extra" w:hAnsi="BRH Devanagari Extra" w:cs="BRH Devanagari Extra"/>
+                <w:color w:val="000000"/>
+                <w:sz w:val="32"/>
+                <w:szCs w:val="40"/>
+              </w:rPr>
+            </w:pPr>
+            <w:r>
+              <w:rPr>
+                <w:rFonts w:ascii="BRH Devanagari Extra" w:hAnsi="BRH Devanagari Extra" w:cs="BRH Devanagari Extra"/>
+                <w:color w:val="000000"/>
+                <w:sz w:val="32"/>
+                <w:szCs w:val="40"/>
+              </w:rPr>
+              <w:t>¶É</w:t>
+            </w:r>
+            <w:r>
+              <w:rPr>
+                <w:rFonts w:ascii="BRH Malayalam Extra" w:hAnsi="BRH Malayalam Extra" w:cs="BRH Devanagari Extra"/>
+                <w:color w:val="000000"/>
+                <w:szCs w:val="40"/>
+              </w:rPr>
+              <w:t>–</w:t>
+            </w:r>
+            <w:r>
+              <w:rPr>
+                <w:rFonts w:ascii="BRH Devanagari Extra" w:hAnsi="BRH Devanagari Extra" w:cs="BRH Devanagari Extra"/>
+                <w:color w:val="000000"/>
+                <w:sz w:val="32"/>
+                <w:szCs w:val="40"/>
+                <w:highlight w:val="yellow"/>
+              </w:rPr>
+              <w:t>lSìÉÿ</w:t>
+            </w:r>
+            <w:r>
+              <w:rPr>
+                <w:rFonts w:ascii="BRH Devanagari Extra" w:hAnsi="BRH Devanagari Extra" w:cs="BRH Devanagari Extra"/>
+                <w:color w:val="000000"/>
+                <w:sz w:val="32"/>
+                <w:szCs w:val="40"/>
+              </w:rPr>
+              <w:t>aÉëÉ</w:t>
+            </w:r>
+            <w:r>
+              <w:rPr>
+                <w:rFonts w:ascii="BRH Malayalam Extra" w:hAnsi="BRH Malayalam Extra" w:cs="BRH Devanagari Extra"/>
+                <w:color w:val="000000"/>
+                <w:szCs w:val="40"/>
+              </w:rPr>
+              <w:t>–</w:t>
+            </w:r>
+            <w:r>
+              <w:rPr>
+                <w:rFonts w:ascii="BRH Devanagari Extra" w:hAnsi="BRH Devanagari Extra" w:cs="BRH Devanagari Extra"/>
+                <w:color w:val="000000"/>
+                <w:sz w:val="32"/>
+                <w:szCs w:val="40"/>
+              </w:rPr>
+              <w:t xml:space="preserve"> ÍkÉrÉþÎlkÉrÉqÉç | </w:t>
+            </w:r>
+          </w:p>
+          <w:p>
+            <w:pPr>
+              <w:widowControl w:val="0"/>
+              <w:autoSpaceDE w:val="0"/>
+              <w:autoSpaceDN w:val="0"/>
+              <w:adjustRightInd w:val="0"/>
+              <w:rPr>
+                <w:rFonts w:ascii="BRH Devanagari Extra" w:hAnsi="BRH Devanagari Extra" w:cs="BRH Devanagari Extra"/>
+                <w:color w:val="000000"/>
+                <w:sz w:val="32"/>
+                <w:szCs w:val="40"/>
+              </w:rPr>
+            </w:pPr>
+            <w:r>
+              <w:rPr>
+                <w:rFonts w:cs="BRH Devanagari Extra"/>
+                <w:color w:val="000000"/>
+                <w:szCs w:val="40"/>
+              </w:rPr>
+              <w:t>37</w:t>
+            </w:r>
+            <w:r>
+              <w:rPr>
+                <w:rFonts w:ascii="BRH Devanagari Extra" w:hAnsi="BRH Devanagari Extra" w:cs="BRH Devanagari Extra"/>
+                <w:color w:val="000000"/>
+                <w:sz w:val="32"/>
+                <w:szCs w:val="40"/>
+              </w:rPr>
+              <w:t>)</w:t>
+            </w:r>
+            <w:r>
+              <w:rPr>
+                <w:rFonts w:ascii="BRH Devanagari Extra" w:hAnsi="BRH Devanagari Extra" w:cs="BRH Devanagari Extra"/>
+                <w:color w:val="000000"/>
+                <w:sz w:val="32"/>
+                <w:szCs w:val="40"/>
+              </w:rPr>
+              <w:tab/>
+            </w:r>
+            <w:r>
+              <w:rPr>
+                <w:rFonts w:cs="BRH Devanagari Extra"/>
+                <w:color w:val="000000"/>
+                <w:szCs w:val="40"/>
+              </w:rPr>
+              <w:t>1</w:t>
+            </w:r>
+            <w:r>
+              <w:rPr>
+                <w:rFonts w:ascii="BRH Devanagari Extra" w:hAnsi="BRH Devanagari Extra" w:cs="BRH Devanagari Extra"/>
+                <w:color w:val="000000"/>
+                <w:sz w:val="32"/>
+                <w:szCs w:val="40"/>
+              </w:rPr>
+              <w:t>.</w:t>
+            </w:r>
+            <w:r>
+              <w:rPr>
+                <w:rFonts w:cs="BRH Devanagari Extra"/>
+                <w:color w:val="000000"/>
+                <w:szCs w:val="40"/>
+              </w:rPr>
+              <w:t>1</w:t>
+            </w:r>
+            <w:r>
+              <w:rPr>
+                <w:rFonts w:ascii="BRH Devanagari Extra" w:hAnsi="BRH Devanagari Extra" w:cs="BRH Devanagari Extra"/>
+                <w:color w:val="000000"/>
+                <w:sz w:val="32"/>
+                <w:szCs w:val="40"/>
+              </w:rPr>
+              <w:t>.</w:t>
+            </w:r>
+            <w:r>
+              <w:rPr>
+                <w:rFonts w:cs="BRH Devanagari Extra"/>
+                <w:color w:val="000000"/>
+                <w:szCs w:val="40"/>
+              </w:rPr>
+              <w:t>14</w:t>
+            </w:r>
+            <w:r>
+              <w:rPr>
+                <w:rFonts w:ascii="BRH Devanagari Extra" w:hAnsi="BRH Devanagari Extra" w:cs="BRH Devanagari Extra"/>
+                <w:color w:val="000000"/>
+                <w:sz w:val="32"/>
+                <w:szCs w:val="40"/>
+              </w:rPr>
+              <w:t>.</w:t>
+            </w:r>
+            <w:r>
+              <w:rPr>
+                <w:rFonts w:cs="BRH Devanagari Extra"/>
+                <w:color w:val="000000"/>
+                <w:szCs w:val="40"/>
+              </w:rPr>
+              <w:t>2</w:t>
+            </w:r>
+            <w:r>
+              <w:rPr>
+                <w:rFonts w:ascii="BRH Devanagari Extra" w:hAnsi="BRH Devanagari Extra" w:cs="BRH Devanagari Extra"/>
+                <w:color w:val="000000"/>
+                <w:sz w:val="32"/>
+                <w:szCs w:val="40"/>
+              </w:rPr>
+              <w:t>(</w:t>
+            </w:r>
+            <w:r>
+              <w:rPr>
+                <w:rFonts w:cs="BRH Devanagari Extra"/>
+                <w:color w:val="000000"/>
+                <w:szCs w:val="40"/>
+              </w:rPr>
+              <w:t>34</w:t>
+            </w:r>
+            <w:r>
+              <w:rPr>
+                <w:rFonts w:ascii="BRH Devanagari Extra" w:hAnsi="BRH Devanagari Extra" w:cs="BRH Devanagari Extra"/>
+                <w:color w:val="000000"/>
+                <w:sz w:val="32"/>
+                <w:szCs w:val="40"/>
+              </w:rPr>
+              <w:t>)- cÉ</w:t>
+            </w:r>
+            <w:r>
+              <w:rPr>
+                <w:rFonts w:ascii="BRH Malayalam Extra" w:hAnsi="BRH Malayalam Extra" w:cs="BRH Devanagari Extra"/>
+                <w:color w:val="000000"/>
+                <w:szCs w:val="40"/>
+              </w:rPr>
+              <w:t>–</w:t>
+            </w:r>
+            <w:r>
+              <w:rPr>
+                <w:rFonts w:ascii="BRH Devanagari Extra" w:hAnsi="BRH Devanagari Extra" w:cs="BRH Devanagari Extra"/>
+                <w:color w:val="000000"/>
+                <w:sz w:val="32"/>
+                <w:szCs w:val="40"/>
+                <w:highlight w:val="yellow"/>
+              </w:rPr>
+              <w:t>lSìÉÿaÉëÉÈ</w:t>
+            </w:r>
+            <w:r>
+              <w:rPr>
+                <w:rFonts w:ascii="BRH Devanagari Extra" w:hAnsi="BRH Devanagari Extra" w:cs="BRH Devanagari Extra"/>
+                <w:color w:val="000000"/>
+                <w:sz w:val="32"/>
+                <w:szCs w:val="40"/>
+              </w:rPr>
+              <w:t xml:space="preserve"> | ÍkÉrÉþÎlkÉrÉqÉç | </w:t>
+            </w:r>
+          </w:p>
+          <w:p>
+            <w:pPr>
+              <w:widowControl w:val="0"/>
+              <w:autoSpaceDE w:val="0"/>
+              <w:autoSpaceDN w:val="0"/>
+              <w:adjustRightInd w:val="0"/>
+              <w:rPr>
+                <w:rFonts w:ascii="BRH Devanagari Extra" w:hAnsi="BRH Devanagari Extra" w:cs="BRH Devanagari Extra"/>
+                <w:color w:val="000000"/>
+                <w:sz w:val="32"/>
+                <w:szCs w:val="40"/>
+              </w:rPr>
+            </w:pPr>
+            <w:r>
+              <w:rPr>
+                <w:rFonts w:ascii="BRH Devanagari Extra" w:hAnsi="BRH Devanagari Extra" w:cs="BRH Devanagari Extra"/>
+                <w:color w:val="000000"/>
+                <w:sz w:val="32"/>
+                <w:szCs w:val="40"/>
+              </w:rPr>
+              <w:t>xÉÏ</w:t>
+            </w:r>
+            <w:r>
+              <w:rPr>
+                <w:rFonts w:ascii="BRH Malayalam Extra" w:hAnsi="BRH Malayalam Extra" w:cs="BRH Devanagari Extra"/>
+                <w:color w:val="000000"/>
+                <w:szCs w:val="40"/>
+              </w:rPr>
+              <w:t>–</w:t>
+            </w:r>
+            <w:r>
+              <w:rPr>
+                <w:rFonts w:ascii="BRH Devanagari Extra" w:hAnsi="BRH Devanagari Extra" w:cs="BRH Devanagari Extra"/>
+                <w:color w:val="000000"/>
+                <w:sz w:val="32"/>
+                <w:szCs w:val="40"/>
+              </w:rPr>
+              <w:t>wÉ</w:t>
+            </w:r>
+            <w:r>
+              <w:rPr>
+                <w:rFonts w:ascii="BRH Malayalam Extra" w:hAnsi="BRH Malayalam Extra" w:cs="BRH Devanagari Extra"/>
+                <w:color w:val="000000"/>
+                <w:szCs w:val="40"/>
+              </w:rPr>
+              <w:t>–</w:t>
+            </w:r>
+            <w:r>
+              <w:rPr>
+                <w:rFonts w:ascii="BRH Devanagari Extra" w:hAnsi="BRH Devanagari Extra" w:cs="BRH Devanagari Extra"/>
+                <w:color w:val="000000"/>
+                <w:sz w:val="32"/>
+                <w:szCs w:val="40"/>
+              </w:rPr>
+              <w:t>kÉÉ</w:t>
+            </w:r>
+            <w:r>
+              <w:rPr>
+                <w:rFonts w:ascii="BRH Malayalam Extra" w:hAnsi="BRH Malayalam Extra" w:cs="BRH Devanagari Extra"/>
+                <w:color w:val="000000"/>
+                <w:szCs w:val="40"/>
+              </w:rPr>
+              <w:t>–</w:t>
+            </w:r>
+            <w:r>
+              <w:rPr>
+                <w:rFonts w:ascii="BRH Devanagari Extra" w:hAnsi="BRH Devanagari Extra" w:cs="BRH Devanagari Extra"/>
+                <w:color w:val="000000"/>
+                <w:sz w:val="32"/>
+                <w:szCs w:val="40"/>
+              </w:rPr>
+              <w:t>ÌiÉ</w:t>
+            </w:r>
+            <w:r>
+              <w:rPr>
+                <w:rFonts w:ascii="BRH Malayalam Extra" w:hAnsi="BRH Malayalam Extra" w:cs="BRH Devanagari Extra"/>
+                <w:color w:val="000000"/>
+                <w:szCs w:val="40"/>
+              </w:rPr>
+              <w:t>–</w:t>
+            </w:r>
+            <w:r>
+              <w:rPr>
+                <w:rFonts w:ascii="BRH Devanagari Extra" w:hAnsi="BRH Devanagari Extra" w:cs="BRH Devanagari Extra"/>
+                <w:color w:val="000000"/>
+                <w:sz w:val="32"/>
+                <w:szCs w:val="40"/>
+              </w:rPr>
+              <w:t xml:space="preserve"> |</w:t>
+            </w:r>
+          </w:p>
+          <w:p>
+            <w:pPr>
+              <w:widowControl w:val="0"/>
+              <w:autoSpaceDE w:val="0"/>
+              <w:autoSpaceDN w:val="0"/>
+              <w:adjustRightInd w:val="0"/>
+              <w:rPr>
+                <w:rFonts w:ascii="BRH Devanagari Extra" w:hAnsi="BRH Devanagari Extra" w:cs="BRH Devanagari Extra"/>
+                <w:color w:val="000000"/>
+                <w:sz w:val="32"/>
+                <w:szCs w:val="40"/>
+              </w:rPr>
+            </w:pPr>
+            <w:r>
+              <w:rPr>
+                <w:rFonts w:ascii="BRH Devanagari Extra" w:hAnsi="BRH Devanagari Extra" w:cs="BRH Devanagari Extra"/>
+                <w:color w:val="000000"/>
+                <w:sz w:val="32"/>
+                <w:szCs w:val="40"/>
+              </w:rPr>
+              <w:t>cÉ</w:t>
+            </w:r>
+            <w:r>
+              <w:rPr>
+                <w:rFonts w:ascii="BRH Malayalam Extra" w:hAnsi="BRH Malayalam Extra" w:cs="BRH Devanagari Extra"/>
+                <w:color w:val="000000"/>
+                <w:szCs w:val="40"/>
+              </w:rPr>
+              <w:t>–</w:t>
+            </w:r>
+            <w:r>
+              <w:rPr>
+                <w:rFonts w:ascii="BRH Devanagari Extra" w:hAnsi="BRH Devanagari Extra" w:cs="BRH Devanagari Extra"/>
+                <w:color w:val="000000"/>
+                <w:sz w:val="32"/>
+                <w:szCs w:val="40"/>
+                <w:highlight w:val="yellow"/>
+              </w:rPr>
+              <w:t>lSìÉ</w:t>
+            </w:r>
+            <w:r>
+              <w:rPr>
+                <w:rFonts w:ascii="BRH Devanagari Extra" w:hAnsi="BRH Devanagari Extra" w:cs="BRH Devanagari Extra"/>
+                <w:color w:val="000000"/>
+                <w:sz w:val="32"/>
+                <w:szCs w:val="40"/>
+              </w:rPr>
+              <w:t>ÿaÉëÉ</w:t>
+            </w:r>
+            <w:r>
+              <w:rPr>
+                <w:rFonts w:ascii="BRH Malayalam Extra" w:hAnsi="BRH Malayalam Extra" w:cs="BRH Devanagari Extra"/>
+                <w:color w:val="000000"/>
+                <w:szCs w:val="40"/>
+              </w:rPr>
+              <w:t>–</w:t>
+            </w:r>
+            <w:r>
+              <w:rPr>
+                <w:rFonts w:ascii="BRH Devanagari Extra" w:hAnsi="BRH Devanagari Extra" w:cs="BRH Devanagari Extra"/>
+                <w:color w:val="000000"/>
+                <w:sz w:val="32"/>
+                <w:szCs w:val="40"/>
+              </w:rPr>
+              <w:t xml:space="preserve"> ÍkÉrÉþÎlkÉrÉ</w:t>
+            </w:r>
+            <w:r>
+              <w:rPr>
+                <w:rFonts w:ascii="BRH Malayalam Extra" w:hAnsi="BRH Malayalam Extra" w:cs="BRH Devanagari Extra"/>
+                <w:color w:val="000000"/>
+                <w:szCs w:val="40"/>
+              </w:rPr>
+              <w:t>–</w:t>
+            </w:r>
+            <w:r>
+              <w:rPr>
+                <w:rFonts w:ascii="BRH Devanagari Extra" w:hAnsi="BRH Devanagari Extra" w:cs="BRH Devanagari Extra"/>
+                <w:color w:val="000000"/>
+                <w:sz w:val="32"/>
+                <w:szCs w:val="40"/>
+              </w:rPr>
+              <w:t>qÉç ÍkÉrÉþÎlkÉrÉqÉç cÉ</w:t>
+            </w:r>
+            <w:r>
+              <w:rPr>
+                <w:rFonts w:ascii="BRH Malayalam Extra" w:hAnsi="BRH Malayalam Extra" w:cs="BRH Devanagari Extra"/>
+                <w:color w:val="000000"/>
+                <w:szCs w:val="40"/>
+              </w:rPr>
+              <w:t>–</w:t>
+            </w:r>
+            <w:r>
+              <w:rPr>
+                <w:rFonts w:ascii="BRH Devanagari Extra" w:hAnsi="BRH Devanagari Extra" w:cs="BRH Devanagari Extra"/>
+                <w:color w:val="000000"/>
+                <w:sz w:val="32"/>
+                <w:szCs w:val="40"/>
+                <w:highlight w:val="yellow"/>
+              </w:rPr>
+              <w:t>lSìÉÿaÉë</w:t>
+            </w:r>
+            <w:r>
+              <w:rPr>
+                <w:rFonts w:ascii="BRH Devanagari Extra" w:hAnsi="BRH Devanagari Extra" w:cs="BRH Devanagari Extra"/>
+                <w:color w:val="000000"/>
+                <w:sz w:val="32"/>
+                <w:szCs w:val="40"/>
+              </w:rPr>
+              <w:t>É ¶É</w:t>
+            </w:r>
+            <w:r>
+              <w:rPr>
+                <w:rFonts w:ascii="BRH Malayalam Extra" w:hAnsi="BRH Malayalam Extra" w:cs="BRH Devanagari Extra"/>
+                <w:color w:val="000000"/>
+                <w:szCs w:val="40"/>
+              </w:rPr>
+              <w:t>–</w:t>
+            </w:r>
+            <w:r>
+              <w:rPr>
+                <w:rFonts w:ascii="BRH Devanagari Extra" w:hAnsi="BRH Devanagari Extra" w:cs="BRH Devanagari Extra"/>
+                <w:color w:val="000000"/>
+                <w:sz w:val="32"/>
+                <w:szCs w:val="40"/>
+                <w:highlight w:val="yellow"/>
+              </w:rPr>
+              <w:t>lSìÉ</w:t>
+            </w:r>
+            <w:r>
+              <w:rPr>
+                <w:rFonts w:ascii="BRH Devanagari Extra" w:hAnsi="BRH Devanagari Extra" w:cs="BRH Devanagari Extra"/>
+                <w:color w:val="000000"/>
+                <w:sz w:val="32"/>
+                <w:szCs w:val="40"/>
+              </w:rPr>
+              <w:t>ÿaÉë</w:t>
+            </w:r>
+            <w:r>
+              <w:rPr>
+                <w:rFonts w:ascii="BRH Devanagari Extra" w:hAnsi="BRH Devanagari Extra" w:cs="BRH Devanagari Extra"/>
+                <w:color w:val="000000"/>
+                <w:sz w:val="32"/>
+                <w:szCs w:val="40"/>
+                <w:highlight w:val="yellow"/>
+              </w:rPr>
+              <w:t>É</w:t>
+            </w:r>
+            <w:r>
+              <w:rPr>
+                <w:rFonts w:ascii="BRH Malayalam Extra" w:hAnsi="BRH Malayalam Extra" w:cs="BRH Devanagari Extra"/>
+                <w:color w:val="000000"/>
+                <w:szCs w:val="40"/>
+                <w:highlight w:val="yellow"/>
+              </w:rPr>
+              <w:t>–</w:t>
+            </w:r>
+            <w:r>
+              <w:rPr>
+                <w:rFonts w:ascii="BRH Devanagari Extra" w:hAnsi="BRH Devanagari Extra" w:cs="BRH Devanagari Extra"/>
+                <w:color w:val="000000"/>
+                <w:sz w:val="32"/>
+                <w:szCs w:val="40"/>
+              </w:rPr>
+              <w:t xml:space="preserve"> ÍkÉrÉþÎlkÉrÉ</w:t>
+            </w:r>
+            <w:r>
+              <w:rPr>
+                <w:rFonts w:ascii="BRH Devanagari Extra" w:hAnsi="BRH Devanagari Extra" w:cs="BRH Devanagari Extra"/>
+                <w:color w:val="000000"/>
+                <w:sz w:val="28"/>
+                <w:szCs w:val="40"/>
+              </w:rPr>
+              <w:t>óè</w:t>
+            </w:r>
+            <w:r>
+              <w:rPr>
+                <w:rFonts w:ascii="BRH Devanagari Extra" w:hAnsi="BRH Devanagari Extra" w:cs="BRH Devanagari Extra"/>
+                <w:color w:val="000000"/>
+                <w:sz w:val="32"/>
+                <w:szCs w:val="40"/>
+              </w:rPr>
+              <w:t xml:space="preserve"> xÉÏwÉkÉÉÌiÉ xÉÏwÉkÉÉÌiÉ</w:t>
+            </w:r>
+            <w:r>
+              <w:rPr>
+                <w:rFonts w:ascii="BRH Malayalam Extra" w:hAnsi="BRH Malayalam Extra" w:cs="BRH Devanagari Extra"/>
+                <w:color w:val="000000"/>
+                <w:szCs w:val="40"/>
+              </w:rPr>
+              <w:t>–</w:t>
+            </w:r>
+            <w:r>
+              <w:rPr>
+                <w:rFonts w:ascii="BRH Devanagari Extra" w:hAnsi="BRH Devanagari Extra" w:cs="BRH Devanagari Extra"/>
+                <w:color w:val="000000"/>
+                <w:sz w:val="32"/>
+                <w:szCs w:val="40"/>
+              </w:rPr>
+              <w:t xml:space="preserve"> ÍkÉrÉþÎlkÉrÉqÉç cÉ</w:t>
+            </w:r>
+            <w:r>
+              <w:rPr>
+                <w:rFonts w:ascii="BRH Malayalam Extra" w:hAnsi="BRH Malayalam Extra" w:cs="BRH Devanagari Extra"/>
+                <w:color w:val="000000"/>
+                <w:szCs w:val="40"/>
+              </w:rPr>
+              <w:t>–</w:t>
+            </w:r>
+            <w:r>
+              <w:rPr>
+                <w:rFonts w:ascii="BRH Devanagari Extra" w:hAnsi="BRH Devanagari Extra" w:cs="BRH Devanagari Extra"/>
+                <w:color w:val="000000"/>
+                <w:sz w:val="32"/>
+                <w:szCs w:val="40"/>
+                <w:highlight w:val="yellow"/>
+              </w:rPr>
+              <w:t>lSìÉÿaÉëÉ</w:t>
+            </w:r>
+            <w:r>
+              <w:rPr>
+                <w:rFonts w:ascii="BRH Devanagari Extra" w:hAnsi="BRH Devanagari Extra" w:cs="BRH Devanagari Extra"/>
+                <w:color w:val="000000"/>
+                <w:sz w:val="32"/>
+                <w:szCs w:val="40"/>
+              </w:rPr>
+              <w:t xml:space="preserve"> </w:t>
+            </w:r>
+          </w:p>
+          <w:p>
+            <w:pPr>
+              <w:widowControl w:val="0"/>
+              <w:autoSpaceDE w:val="0"/>
+              <w:autoSpaceDN w:val="0"/>
+              <w:adjustRightInd w:val="0"/>
+              <w:rPr>
+                <w:rFonts w:ascii="BRH Devanagari Extra" w:hAnsi="BRH Devanagari Extra" w:cs="BRH Devanagari Extra"/>
+                <w:color w:val="000000"/>
+                <w:sz w:val="32"/>
+                <w:szCs w:val="40"/>
+              </w:rPr>
+            </w:pPr>
+            <w:r>
+              <w:rPr>
+                <w:rFonts w:ascii="BRH Devanagari Extra" w:hAnsi="BRH Devanagari Extra" w:cs="BRH Devanagari Extra"/>
+                <w:color w:val="000000"/>
+                <w:sz w:val="32"/>
+                <w:szCs w:val="40"/>
+              </w:rPr>
+              <w:t>¶É</w:t>
+            </w:r>
+            <w:r>
+              <w:rPr>
+                <w:rFonts w:ascii="BRH Malayalam Extra" w:hAnsi="BRH Malayalam Extra" w:cs="BRH Devanagari Extra"/>
+                <w:color w:val="000000"/>
+                <w:szCs w:val="40"/>
+              </w:rPr>
+              <w:t>–</w:t>
+            </w:r>
+            <w:r>
+              <w:rPr>
+                <w:rFonts w:ascii="BRH Devanagari Extra" w:hAnsi="BRH Devanagari Extra" w:cs="BRH Devanagari Extra"/>
+                <w:color w:val="000000"/>
+                <w:sz w:val="32"/>
+                <w:szCs w:val="40"/>
+                <w:highlight w:val="yellow"/>
+              </w:rPr>
+              <w:t>lSìÉ</w:t>
+            </w:r>
+            <w:r>
+              <w:rPr>
+                <w:rFonts w:ascii="BRH Devanagari Extra" w:hAnsi="BRH Devanagari Extra" w:cs="BRH Devanagari Extra"/>
+                <w:color w:val="000000"/>
+                <w:sz w:val="32"/>
+                <w:szCs w:val="40"/>
+              </w:rPr>
+              <w:t>ÿaÉëÉ</w:t>
+            </w:r>
+            <w:r>
+              <w:rPr>
+                <w:rFonts w:ascii="BRH Malayalam Extra" w:hAnsi="BRH Malayalam Extra" w:cs="BRH Devanagari Extra"/>
+                <w:color w:val="000000"/>
+                <w:szCs w:val="40"/>
+              </w:rPr>
+              <w:t>–</w:t>
+            </w:r>
+            <w:r>
+              <w:rPr>
+                <w:rFonts w:ascii="BRH Devanagari Extra" w:hAnsi="BRH Devanagari Extra" w:cs="BRH Devanagari Extra"/>
+                <w:color w:val="000000"/>
+                <w:sz w:val="32"/>
+                <w:szCs w:val="40"/>
+              </w:rPr>
+              <w:t xml:space="preserve"> ÍkÉrÉþÎlkÉrÉ</w:t>
+            </w:r>
+            <w:r>
+              <w:rPr>
+                <w:rFonts w:ascii="BRH Devanagari Extra" w:hAnsi="BRH Devanagari Extra" w:cs="BRH Devanagari Extra"/>
+                <w:color w:val="000000"/>
+                <w:sz w:val="28"/>
+                <w:szCs w:val="40"/>
+              </w:rPr>
+              <w:t>óè</w:t>
+            </w:r>
+            <w:r>
+              <w:rPr>
+                <w:rFonts w:ascii="BRH Devanagari Extra" w:hAnsi="BRH Devanagari Extra" w:cs="BRH Devanagari Extra"/>
+                <w:color w:val="000000"/>
+                <w:sz w:val="32"/>
+                <w:szCs w:val="40"/>
+              </w:rPr>
+              <w:t xml:space="preserve"> xÉÏwÉkÉÉÌiÉ | </w:t>
+            </w:r>
+          </w:p>
+          <w:p>
+            <w:pPr>
+              <w:widowControl w:val="0"/>
+              <w:autoSpaceDE w:val="0"/>
+              <w:autoSpaceDN w:val="0"/>
+              <w:adjustRightInd w:val="0"/>
+              <w:rPr>
+                <w:rFonts w:ascii="BRH Devanagari Extra" w:hAnsi="BRH Devanagari Extra" w:cs="BRH Devanagari Extra"/>
+                <w:color w:val="000000"/>
+                <w:sz w:val="32"/>
+                <w:szCs w:val="40"/>
+              </w:rPr>
+            </w:pPr>
+            <w:r>
+              <w:rPr>
+                <w:rFonts w:cs="BRH Devanagari Extra"/>
+                <w:color w:val="000000"/>
+                <w:szCs w:val="40"/>
+              </w:rPr>
+              <w:t>38</w:t>
+            </w:r>
+            <w:r>
+              <w:rPr>
+                <w:rFonts w:ascii="BRH Devanagari Extra" w:hAnsi="BRH Devanagari Extra" w:cs="BRH Devanagari Extra"/>
+                <w:color w:val="000000"/>
+                <w:sz w:val="32"/>
+                <w:szCs w:val="40"/>
+              </w:rPr>
+              <w:t>)</w:t>
+            </w:r>
+            <w:r>
+              <w:rPr>
+                <w:rFonts w:ascii="BRH Devanagari Extra" w:hAnsi="BRH Devanagari Extra" w:cs="BRH Devanagari Extra"/>
+                <w:color w:val="000000"/>
+                <w:sz w:val="32"/>
+                <w:szCs w:val="40"/>
+              </w:rPr>
+              <w:tab/>
+            </w:r>
+            <w:r>
+              <w:rPr>
+                <w:rFonts w:cs="BRH Devanagari Extra"/>
+                <w:color w:val="000000"/>
+                <w:szCs w:val="40"/>
+              </w:rPr>
+              <w:t>1</w:t>
+            </w:r>
+            <w:r>
+              <w:rPr>
+                <w:rFonts w:ascii="BRH Devanagari Extra" w:hAnsi="BRH Devanagari Extra" w:cs="BRH Devanagari Extra"/>
+                <w:color w:val="000000"/>
+                <w:sz w:val="32"/>
+                <w:szCs w:val="40"/>
+              </w:rPr>
+              <w:t>.</w:t>
+            </w:r>
+            <w:r>
+              <w:rPr>
+                <w:rFonts w:cs="BRH Devanagari Extra"/>
+                <w:color w:val="000000"/>
+                <w:szCs w:val="40"/>
+              </w:rPr>
+              <w:t>1</w:t>
+            </w:r>
+            <w:r>
+              <w:rPr>
+                <w:rFonts w:ascii="BRH Devanagari Extra" w:hAnsi="BRH Devanagari Extra" w:cs="BRH Devanagari Extra"/>
+                <w:color w:val="000000"/>
+                <w:sz w:val="32"/>
+                <w:szCs w:val="40"/>
+              </w:rPr>
+              <w:t>.</w:t>
+            </w:r>
+            <w:r>
+              <w:rPr>
+                <w:rFonts w:cs="BRH Devanagari Extra"/>
+                <w:color w:val="000000"/>
+                <w:szCs w:val="40"/>
+              </w:rPr>
+              <w:t>14</w:t>
+            </w:r>
+            <w:r>
+              <w:rPr>
+                <w:rFonts w:ascii="BRH Devanagari Extra" w:hAnsi="BRH Devanagari Extra" w:cs="BRH Devanagari Extra"/>
+                <w:color w:val="000000"/>
+                <w:sz w:val="32"/>
+                <w:szCs w:val="40"/>
+              </w:rPr>
+              <w:t>.</w:t>
+            </w:r>
+            <w:r>
+              <w:rPr>
+                <w:rFonts w:cs="BRH Devanagari Extra"/>
+                <w:color w:val="000000"/>
+                <w:szCs w:val="40"/>
+              </w:rPr>
+              <w:t>2</w:t>
+            </w:r>
+            <w:r>
+              <w:rPr>
+                <w:rFonts w:ascii="BRH Devanagari Extra" w:hAnsi="BRH Devanagari Extra" w:cs="BRH Devanagari Extra"/>
+                <w:color w:val="000000"/>
+                <w:sz w:val="32"/>
+                <w:szCs w:val="40"/>
+              </w:rPr>
+              <w:t>(</w:t>
+            </w:r>
+            <w:r>
+              <w:rPr>
+                <w:rFonts w:cs="BRH Devanagari Extra"/>
+                <w:color w:val="000000"/>
+                <w:szCs w:val="40"/>
+              </w:rPr>
+              <w:t>34</w:t>
+            </w:r>
+            <w:r>
+              <w:rPr>
+                <w:rFonts w:ascii="BRH Devanagari Extra" w:hAnsi="BRH Devanagari Extra" w:cs="BRH Devanagari Extra"/>
+                <w:color w:val="000000"/>
+                <w:sz w:val="32"/>
+                <w:szCs w:val="40"/>
+              </w:rPr>
+              <w:t>)- cÉ</w:t>
+            </w:r>
+            <w:r>
+              <w:rPr>
+                <w:rFonts w:ascii="BRH Malayalam Extra" w:hAnsi="BRH Malayalam Extra" w:cs="BRH Devanagari Extra"/>
+                <w:color w:val="000000"/>
+                <w:szCs w:val="40"/>
+              </w:rPr>
+              <w:t>–</w:t>
+            </w:r>
+            <w:r>
+              <w:rPr>
+                <w:rFonts w:ascii="BRH Devanagari Extra" w:hAnsi="BRH Devanagari Extra" w:cs="BRH Devanagari Extra"/>
+                <w:color w:val="000000"/>
+                <w:sz w:val="32"/>
+                <w:szCs w:val="40"/>
+              </w:rPr>
+              <w:t>l</w:t>
+            </w:r>
+            <w:r>
+              <w:rPr>
+                <w:rFonts w:ascii="BRH Devanagari Extra" w:hAnsi="BRH Devanagari Extra" w:cs="BRH Devanagari Extra"/>
+                <w:color w:val="000000"/>
+                <w:sz w:val="32"/>
+                <w:szCs w:val="40"/>
+                <w:highlight w:val="yellow"/>
+              </w:rPr>
+              <w:t>SìÉÿaÉëÉÈ</w:t>
+            </w:r>
+            <w:r>
+              <w:rPr>
+                <w:rFonts w:ascii="BRH Devanagari Extra" w:hAnsi="BRH Devanagari Extra" w:cs="BRH Devanagari Extra"/>
+                <w:color w:val="000000"/>
+                <w:sz w:val="32"/>
+                <w:szCs w:val="40"/>
+              </w:rPr>
+              <w:t xml:space="preserve"> |</w:t>
+            </w:r>
+          </w:p>
+          <w:p>
+            <w:pPr>
+              <w:widowControl w:val="0"/>
+              <w:autoSpaceDE w:val="0"/>
+              <w:autoSpaceDN w:val="0"/>
+              <w:adjustRightInd w:val="0"/>
+              <w:rPr>
+                <w:rFonts w:ascii="BRH Devanagari Extra" w:hAnsi="BRH Devanagari Extra" w:cs="BRH Devanagari Extra"/>
+                <w:color w:val="000000"/>
+                <w:sz w:val="32"/>
+                <w:szCs w:val="40"/>
+              </w:rPr>
+            </w:pPr>
+            <w:r>
+              <w:rPr>
+                <w:rFonts w:ascii="BRH Devanagari Extra" w:hAnsi="BRH Devanagari Extra" w:cs="BRH Devanagari Extra"/>
+                <w:color w:val="000000"/>
+                <w:sz w:val="32"/>
+                <w:szCs w:val="40"/>
+              </w:rPr>
+              <w:t>cÉ</w:t>
+            </w:r>
+            <w:r>
+              <w:rPr>
+                <w:rFonts w:ascii="BRH Malayalam Extra" w:hAnsi="BRH Malayalam Extra" w:cs="BRH Devanagari Extra"/>
+                <w:color w:val="000000"/>
+                <w:szCs w:val="40"/>
+              </w:rPr>
+              <w:t>–</w:t>
+            </w:r>
+            <w:r>
+              <w:rPr>
+                <w:rFonts w:ascii="BRH Devanagari Extra" w:hAnsi="BRH Devanagari Extra" w:cs="BRH Devanagari Extra"/>
+                <w:color w:val="000000"/>
+                <w:sz w:val="32"/>
+                <w:szCs w:val="40"/>
+              </w:rPr>
+              <w:t>lSìÉaÉëÉ</w:t>
+            </w:r>
+            <w:r>
+              <w:rPr>
+                <w:rFonts w:ascii="BRH Malayalam Extra" w:hAnsi="BRH Malayalam Extra" w:cs="BRH Devanagari Extra"/>
+                <w:color w:val="000000"/>
+                <w:szCs w:val="40"/>
+              </w:rPr>
+              <w:t>–</w:t>
+            </w:r>
+            <w:r>
+              <w:rPr>
+                <w:rFonts w:ascii="BRH Devanagari Extra" w:hAnsi="BRH Devanagari Extra" w:cs="BRH Devanagari Extra"/>
+                <w:color w:val="000000"/>
+                <w:sz w:val="32"/>
+                <w:szCs w:val="40"/>
+              </w:rPr>
+              <w:t xml:space="preserve"> CÌiÉþ cÉ</w:t>
+            </w:r>
+            <w:r>
+              <w:rPr>
+                <w:rFonts w:ascii="BRH Malayalam Extra" w:hAnsi="BRH Malayalam Extra" w:cs="BRH Devanagari Extra"/>
+                <w:color w:val="000000"/>
+                <w:szCs w:val="40"/>
+              </w:rPr>
+              <w:t>–</w:t>
+            </w:r>
+            <w:r>
+              <w:rPr>
+                <w:rFonts w:ascii="BRH Devanagari Extra" w:hAnsi="BRH Devanagari Extra" w:cs="BRH Devanagari Extra"/>
+                <w:color w:val="000000"/>
+                <w:sz w:val="32"/>
+                <w:szCs w:val="40"/>
+              </w:rPr>
+              <w:t>lSì - A</w:t>
+            </w:r>
+            <w:r>
+              <w:rPr>
+                <w:rFonts w:ascii="BRH Malayalam Extra" w:hAnsi="BRH Malayalam Extra" w:cs="BRH Devanagari Extra"/>
+                <w:color w:val="000000"/>
+                <w:szCs w:val="40"/>
+              </w:rPr>
+              <w:t>–</w:t>
+            </w:r>
+            <w:r>
+              <w:rPr>
+                <w:rFonts w:ascii="BRH Devanagari Extra" w:hAnsi="BRH Devanagari Extra" w:cs="BRH Devanagari Extra"/>
+                <w:color w:val="000000"/>
+                <w:sz w:val="32"/>
+                <w:szCs w:val="40"/>
+              </w:rPr>
+              <w:t>aÉëÉ</w:t>
+            </w:r>
+            <w:r>
+              <w:rPr>
+                <w:rFonts w:ascii="BRH Malayalam Extra" w:hAnsi="BRH Malayalam Extra" w:cs="BRH Devanagari Extra"/>
+                <w:color w:val="000000"/>
+                <w:szCs w:val="40"/>
+              </w:rPr>
+              <w:t>–</w:t>
+            </w:r>
+            <w:r>
+              <w:rPr>
+                <w:rFonts w:ascii="BRH Devanagari Extra" w:hAnsi="BRH Devanagari Extra" w:cs="BRH Devanagari Extra"/>
+                <w:color w:val="000000"/>
+                <w:sz w:val="32"/>
+                <w:szCs w:val="40"/>
+              </w:rPr>
+              <w:t xml:space="preserve">È | </w:t>
+            </w:r>
+          </w:p>
+          <w:p>
+            <w:pPr>
+              <w:widowControl w:val="0"/>
+              <w:autoSpaceDE w:val="0"/>
+              <w:autoSpaceDN w:val="0"/>
+              <w:adjustRightInd w:val="0"/>
+              <w:rPr>
+                <w:rFonts w:cs="BRH Devanagari Extra"/>
+                <w:color w:val="000000"/>
+                <w:szCs w:val="40"/>
+              </w:rPr>
+            </w:pPr>
+          </w:p>
+        </w:tc>
+        <w:tc>
+          <w:tcPr>
+            <w:tcW w:w="7513" w:type="dxa"/>
+          </w:tcPr>
+          <w:p>
+            <w:pPr>
+              <w:widowControl w:val="0"/>
+              <w:autoSpaceDE w:val="0"/>
+              <w:autoSpaceDN w:val="0"/>
+              <w:adjustRightInd w:val="0"/>
+              <w:rPr>
+                <w:rFonts w:ascii="BRH Devanagari Extra" w:hAnsi="BRH Devanagari Extra" w:cs="BRH Devanagari Extra"/>
+                <w:color w:val="000000"/>
+                <w:sz w:val="32"/>
+                <w:szCs w:val="40"/>
+              </w:rPr>
+            </w:pPr>
+            <w:r>
+              <w:rPr>
+                <w:rFonts w:cs="BRH Devanagari Extra"/>
+                <w:color w:val="000000"/>
+                <w:szCs w:val="40"/>
+              </w:rPr>
+              <w:t>35</w:t>
+            </w:r>
+            <w:r>
+              <w:rPr>
+                <w:rFonts w:ascii="BRH Devanagari Extra" w:hAnsi="BRH Devanagari Extra" w:cs="BRH Devanagari Extra"/>
+                <w:color w:val="000000"/>
+                <w:sz w:val="32"/>
+                <w:szCs w:val="40"/>
+              </w:rPr>
+              <w:t>)</w:t>
+            </w:r>
+            <w:r>
+              <w:rPr>
+                <w:rFonts w:ascii="BRH Devanagari Extra" w:hAnsi="BRH Devanagari Extra" w:cs="BRH Devanagari Extra"/>
+                <w:color w:val="000000"/>
+                <w:sz w:val="32"/>
+                <w:szCs w:val="40"/>
+              </w:rPr>
+              <w:tab/>
+            </w:r>
+            <w:r>
+              <w:rPr>
+                <w:rFonts w:cs="BRH Devanagari Extra"/>
+                <w:color w:val="000000"/>
+                <w:szCs w:val="40"/>
+              </w:rPr>
+              <w:t>1</w:t>
+            </w:r>
+            <w:r>
+              <w:rPr>
+                <w:rFonts w:ascii="BRH Devanagari Extra" w:hAnsi="BRH Devanagari Extra" w:cs="BRH Devanagari Extra"/>
+                <w:color w:val="000000"/>
+                <w:sz w:val="32"/>
+                <w:szCs w:val="40"/>
+              </w:rPr>
+              <w:t>.</w:t>
+            </w:r>
+            <w:r>
+              <w:rPr>
+                <w:rFonts w:cs="BRH Devanagari Extra"/>
+                <w:color w:val="000000"/>
+                <w:szCs w:val="40"/>
+              </w:rPr>
+              <w:t>1</w:t>
+            </w:r>
+            <w:r>
+              <w:rPr>
+                <w:rFonts w:ascii="BRH Devanagari Extra" w:hAnsi="BRH Devanagari Extra" w:cs="BRH Devanagari Extra"/>
+                <w:color w:val="000000"/>
+                <w:sz w:val="32"/>
+                <w:szCs w:val="40"/>
+              </w:rPr>
+              <w:t>.</w:t>
+            </w:r>
+            <w:r>
+              <w:rPr>
+                <w:rFonts w:cs="BRH Devanagari Extra"/>
+                <w:color w:val="000000"/>
+                <w:szCs w:val="40"/>
+              </w:rPr>
+              <w:t>14</w:t>
+            </w:r>
+            <w:r>
+              <w:rPr>
+                <w:rFonts w:ascii="BRH Devanagari Extra" w:hAnsi="BRH Devanagari Extra" w:cs="BRH Devanagari Extra"/>
+                <w:color w:val="000000"/>
+                <w:sz w:val="32"/>
+                <w:szCs w:val="40"/>
+              </w:rPr>
+              <w:t>.</w:t>
+            </w:r>
+            <w:r>
+              <w:rPr>
+                <w:rFonts w:cs="BRH Devanagari Extra"/>
+                <w:color w:val="000000"/>
+                <w:szCs w:val="40"/>
+              </w:rPr>
+              <w:t>2</w:t>
+            </w:r>
+            <w:r>
+              <w:rPr>
+                <w:rFonts w:ascii="BRH Devanagari Extra" w:hAnsi="BRH Devanagari Extra" w:cs="BRH Devanagari Extra"/>
+                <w:color w:val="000000"/>
+                <w:sz w:val="32"/>
+                <w:szCs w:val="40"/>
+              </w:rPr>
+              <w:t>(</w:t>
+            </w:r>
+            <w:r>
+              <w:rPr>
+                <w:rFonts w:cs="BRH Devanagari Extra"/>
+                <w:color w:val="000000"/>
+                <w:szCs w:val="40"/>
+              </w:rPr>
+              <w:t>32</w:t>
+            </w:r>
+            <w:r>
+              <w:rPr>
+                <w:rFonts w:ascii="BRH Devanagari Extra" w:hAnsi="BRH Devanagari Extra" w:cs="BRH Devanagari Extra"/>
+                <w:color w:val="000000"/>
+                <w:sz w:val="32"/>
+                <w:szCs w:val="40"/>
+              </w:rPr>
+              <w:t>)- UÉ</w:t>
+            </w:r>
+            <w:r>
+              <w:rPr>
+                <w:rFonts w:ascii="BRH Malayalam Extra" w:hAnsi="BRH Malayalam Extra" w:cs="BRH Devanagari Extra"/>
+                <w:color w:val="000000"/>
+                <w:szCs w:val="40"/>
+              </w:rPr>
+              <w:t>–</w:t>
+            </w:r>
+            <w:r>
+              <w:rPr>
+                <w:rFonts w:ascii="BRH Devanagari Extra" w:hAnsi="BRH Devanagari Extra" w:cs="BRH Devanagari Extra"/>
+                <w:color w:val="000000"/>
+                <w:sz w:val="32"/>
+                <w:szCs w:val="40"/>
+              </w:rPr>
+              <w:t>xÉ</w:t>
+            </w:r>
+            <w:r>
+              <w:rPr>
+                <w:rFonts w:ascii="BRH Malayalam Extra" w:hAnsi="BRH Malayalam Extra" w:cs="BRH Devanagari Extra"/>
+                <w:color w:val="000000"/>
+                <w:szCs w:val="40"/>
+              </w:rPr>
+              <w:t>–</w:t>
+            </w:r>
+            <w:r>
+              <w:rPr>
+                <w:rFonts w:ascii="BRH Devanagari Extra" w:hAnsi="BRH Devanagari Extra" w:cs="BRH Devanagari Extra"/>
+                <w:color w:val="000000"/>
+                <w:sz w:val="32"/>
+                <w:szCs w:val="40"/>
+              </w:rPr>
+              <w:t>iÉç | zÉÑ</w:t>
+            </w:r>
+            <w:r>
+              <w:rPr>
+                <w:rFonts w:ascii="BRH Malayalam Extra" w:hAnsi="BRH Malayalam Extra" w:cs="BRH Devanagari Extra"/>
+                <w:color w:val="000000"/>
+                <w:szCs w:val="40"/>
+              </w:rPr>
+              <w:t>–</w:t>
+            </w:r>
+            <w:r>
+              <w:rPr>
+                <w:rFonts w:ascii="BRH Devanagari Extra" w:hAnsi="BRH Devanagari Extra" w:cs="BRH Devanagari Extra"/>
+                <w:color w:val="000000"/>
+                <w:sz w:val="32"/>
+                <w:szCs w:val="40"/>
+              </w:rPr>
+              <w:t>ÂkÉþÈ | cÉ</w:t>
+            </w:r>
+            <w:r>
+              <w:rPr>
+                <w:rFonts w:ascii="BRH Malayalam Extra" w:hAnsi="BRH Malayalam Extra" w:cs="BRH Devanagari Extra"/>
+                <w:color w:val="000000"/>
+                <w:szCs w:val="40"/>
+              </w:rPr>
+              <w:t>–</w:t>
+            </w:r>
+            <w:r>
+              <w:rPr>
+                <w:rFonts w:ascii="BRH Devanagari Extra" w:hAnsi="BRH Devanagari Extra" w:cs="BRH Devanagari Extra"/>
+                <w:color w:val="000000"/>
+                <w:sz w:val="32"/>
+                <w:szCs w:val="40"/>
+                <w:highlight w:val="green"/>
+              </w:rPr>
+              <w:t>lSìÉaÉëÉ</w:t>
+            </w:r>
+            <w:r>
+              <w:rPr>
+                <w:rFonts w:ascii="BRH Devanagari Extra" w:hAnsi="BRH Devanagari Extra" w:cs="BRH Devanagari Extra"/>
+                <w:color w:val="000000"/>
+                <w:sz w:val="32"/>
+                <w:szCs w:val="40"/>
+                <w:highlight w:val="yellow"/>
+              </w:rPr>
+              <w:t>ÿ</w:t>
+            </w:r>
+            <w:r>
+              <w:rPr>
+                <w:rFonts w:ascii="BRH Devanagari Extra" w:hAnsi="BRH Devanagari Extra" w:cs="BRH Devanagari Extra"/>
+                <w:color w:val="000000"/>
+                <w:sz w:val="32"/>
+                <w:szCs w:val="40"/>
+              </w:rPr>
+              <w:t>È |</w:t>
+            </w:r>
+          </w:p>
+          <w:p>
+            <w:pPr>
+              <w:widowControl w:val="0"/>
+              <w:autoSpaceDE w:val="0"/>
+              <w:autoSpaceDN w:val="0"/>
+              <w:adjustRightInd w:val="0"/>
+              <w:rPr>
+                <w:rFonts w:ascii="BRH Devanagari Extra" w:hAnsi="BRH Devanagari Extra" w:cs="BRH Devanagari Extra"/>
+                <w:color w:val="000000"/>
+                <w:sz w:val="32"/>
+                <w:szCs w:val="40"/>
+              </w:rPr>
+            </w:pPr>
+            <w:r>
+              <w:rPr>
+                <w:rFonts w:ascii="BRH Devanagari Extra" w:hAnsi="BRH Devanagari Extra" w:cs="BRH Devanagari Extra"/>
+                <w:color w:val="000000"/>
+                <w:sz w:val="32"/>
+                <w:szCs w:val="40"/>
+              </w:rPr>
+              <w:t>UÉ</w:t>
+            </w:r>
+            <w:r>
+              <w:rPr>
+                <w:rFonts w:ascii="BRH Malayalam Extra" w:hAnsi="BRH Malayalam Extra" w:cs="BRH Devanagari Extra"/>
+                <w:color w:val="000000"/>
+                <w:szCs w:val="40"/>
+              </w:rPr>
+              <w:t>–</w:t>
+            </w:r>
+            <w:r>
+              <w:rPr>
+                <w:rFonts w:ascii="BRH Devanagari Extra" w:hAnsi="BRH Devanagari Extra" w:cs="BRH Devanagari Extra"/>
+                <w:color w:val="000000"/>
+                <w:sz w:val="32"/>
+                <w:szCs w:val="40"/>
+              </w:rPr>
+              <w:t>xÉ</w:t>
+            </w:r>
+            <w:r>
+              <w:rPr>
+                <w:rFonts w:ascii="BRH Malayalam Extra" w:hAnsi="BRH Malayalam Extra" w:cs="BRH Devanagari Extra"/>
+                <w:color w:val="000000"/>
+                <w:szCs w:val="40"/>
+              </w:rPr>
+              <w:t>–</w:t>
+            </w:r>
+            <w:r>
+              <w:rPr>
+                <w:rFonts w:ascii="BRH Malayalam Extra" w:hAnsi="BRH Malayalam Extra" w:cs="BRH Devanagari Extra"/>
+                <w:color w:val="000000"/>
+                <w:szCs w:val="40"/>
+              </w:rPr>
+              <w:t xml:space="preserve"> </w:t>
+            </w:r>
+            <w:r>
+              <w:rPr>
+                <w:rFonts w:ascii="BRH Devanagari Extra" w:hAnsi="BRH Devanagari Extra" w:cs="BRH Devanagari Extra"/>
+                <w:color w:val="000000"/>
+                <w:sz w:val="32"/>
+                <w:szCs w:val="40"/>
+              </w:rPr>
+              <w:t>cNÒû</w:t>
+            </w:r>
+            <w:r>
+              <w:rPr>
+                <w:rFonts w:ascii="BRH Malayalam Extra" w:hAnsi="BRH Malayalam Extra" w:cs="BRH Devanagari Extra"/>
+                <w:color w:val="000000"/>
+                <w:szCs w:val="40"/>
+              </w:rPr>
+              <w:t>–</w:t>
+            </w:r>
+            <w:r>
+              <w:rPr>
+                <w:rFonts w:ascii="BRH Devanagari Extra" w:hAnsi="BRH Devanagari Extra" w:cs="BRH Devanagari Extra"/>
+                <w:color w:val="000000"/>
+                <w:sz w:val="32"/>
+                <w:szCs w:val="40"/>
+              </w:rPr>
+              <w:t>ÂkÉþÈ zÉÑ</w:t>
+            </w:r>
+            <w:r>
+              <w:rPr>
+                <w:rFonts w:ascii="BRH Malayalam Extra" w:hAnsi="BRH Malayalam Extra" w:cs="BRH Devanagari Extra"/>
+                <w:color w:val="000000"/>
+                <w:szCs w:val="40"/>
+              </w:rPr>
+              <w:t>–</w:t>
+            </w:r>
+            <w:r>
+              <w:rPr>
+                <w:rFonts w:ascii="BRH Devanagari Extra" w:hAnsi="BRH Devanagari Extra" w:cs="BRH Devanagari Extra"/>
+                <w:color w:val="000000"/>
+                <w:sz w:val="32"/>
+                <w:szCs w:val="40"/>
+              </w:rPr>
+              <w:t xml:space="preserve">ÂkÉÉåþ UÉxÉSè </w:t>
+            </w:r>
+            <w:r>
+              <w:rPr>
+                <w:rFonts w:ascii="BRH Devanagari Extra" w:hAnsi="BRH Devanagari Extra" w:cs="BRH Devanagari Extra"/>
+                <w:color w:val="000000"/>
+                <w:sz w:val="32"/>
+                <w:szCs w:val="40"/>
+              </w:rPr>
+              <w:t>UÉxÉ</w:t>
+            </w:r>
+            <w:r>
+              <w:rPr>
+                <w:rFonts w:ascii="BRH Devanagari Extra" w:hAnsi="BRH Devanagari Extra" w:cs="BRH Devanagari Extra"/>
+                <w:color w:val="000000"/>
+                <w:sz w:val="32"/>
+                <w:szCs w:val="40"/>
+              </w:rPr>
+              <w:t xml:space="preserve"> cNÒû</w:t>
+            </w:r>
+            <w:r>
+              <w:rPr>
+                <w:rFonts w:ascii="BRH Malayalam Extra" w:hAnsi="BRH Malayalam Extra" w:cs="BRH Devanagari Extra"/>
+                <w:color w:val="000000"/>
+                <w:szCs w:val="40"/>
+              </w:rPr>
+              <w:t>–</w:t>
+            </w:r>
+            <w:r>
+              <w:rPr>
+                <w:rFonts w:ascii="BRH Devanagari Extra" w:hAnsi="BRH Devanagari Extra" w:cs="BRH Devanagari Extra"/>
+                <w:color w:val="000000"/>
+                <w:sz w:val="32"/>
+                <w:szCs w:val="40"/>
+              </w:rPr>
+              <w:t xml:space="preserve">ÂkÉþ </w:t>
+            </w:r>
+            <w:r>
+              <w:rPr>
+                <w:rFonts w:ascii="BRH Devanagari Extra" w:hAnsi="BRH Devanagari Extra" w:cs="BRH Devanagari Extra"/>
+                <w:color w:val="000000"/>
+                <w:sz w:val="32"/>
+                <w:szCs w:val="40"/>
+                <w:highlight w:val="green"/>
+              </w:rPr>
+              <w:t>¶É</w:t>
+            </w:r>
+            <w:r>
+              <w:rPr>
+                <w:rFonts w:ascii="BRH Malayalam Extra" w:hAnsi="BRH Malayalam Extra" w:cs="BRH Devanagari Extra"/>
+                <w:color w:val="000000"/>
+                <w:szCs w:val="40"/>
+                <w:highlight w:val="green"/>
+              </w:rPr>
+              <w:t>–</w:t>
+            </w:r>
+            <w:r>
+              <w:rPr>
+                <w:rFonts w:ascii="BRH Devanagari Extra" w:hAnsi="BRH Devanagari Extra" w:cs="BRH Devanagari Extra"/>
+                <w:color w:val="000000"/>
+                <w:sz w:val="32"/>
+                <w:szCs w:val="40"/>
+                <w:highlight w:val="green"/>
+              </w:rPr>
+              <w:t>lSìÉaÉëÉÿ</w:t>
+            </w:r>
+            <w:r>
+              <w:rPr>
+                <w:rFonts w:ascii="BRH Devanagari Extra" w:hAnsi="BRH Devanagari Extra" w:cs="BRH Devanagari Extra"/>
+                <w:color w:val="000000"/>
+                <w:sz w:val="32"/>
+                <w:szCs w:val="40"/>
+              </w:rPr>
+              <w:t xml:space="preserve"> </w:t>
+            </w:r>
+          </w:p>
+          <w:p>
+            <w:pPr>
+              <w:widowControl w:val="0"/>
+              <w:autoSpaceDE w:val="0"/>
+              <w:autoSpaceDN w:val="0"/>
+              <w:adjustRightInd w:val="0"/>
+              <w:rPr>
+                <w:rFonts w:ascii="BRH Devanagari Extra" w:hAnsi="BRH Devanagari Extra" w:cs="BRH Devanagari Extra"/>
+                <w:color w:val="000000"/>
+                <w:sz w:val="32"/>
+                <w:szCs w:val="40"/>
+              </w:rPr>
+            </w:pPr>
+            <w:r>
+              <w:rPr>
+                <w:rFonts w:ascii="BRH Devanagari Extra" w:hAnsi="BRH Devanagari Extra" w:cs="BRH Devanagari Extra"/>
+                <w:color w:val="000000"/>
+                <w:sz w:val="32"/>
+                <w:szCs w:val="40"/>
+                <w:highlight w:val="green"/>
+              </w:rPr>
+              <w:t>¶É</w:t>
+            </w:r>
+            <w:r>
+              <w:rPr>
+                <w:rFonts w:ascii="BRH Malayalam Extra" w:hAnsi="BRH Malayalam Extra" w:cs="BRH Devanagari Extra"/>
+                <w:color w:val="000000"/>
+                <w:szCs w:val="40"/>
+                <w:highlight w:val="green"/>
+              </w:rPr>
+              <w:t>–</w:t>
+            </w:r>
+            <w:r>
+              <w:rPr>
+                <w:rFonts w:ascii="BRH Devanagari Extra" w:hAnsi="BRH Devanagari Extra" w:cs="BRH Devanagari Extra"/>
+                <w:color w:val="000000"/>
+                <w:sz w:val="32"/>
+                <w:szCs w:val="40"/>
+                <w:highlight w:val="green"/>
+              </w:rPr>
+              <w:t>lSìÉaÉëÉÿÈ</w:t>
+            </w:r>
+            <w:r>
+              <w:rPr>
+                <w:rFonts w:ascii="BRH Devanagari Extra" w:hAnsi="BRH Devanagari Extra" w:cs="BRH Devanagari Extra"/>
+                <w:color w:val="000000"/>
+                <w:sz w:val="32"/>
+                <w:szCs w:val="40"/>
+              </w:rPr>
+              <w:t xml:space="preserve"> zÉÑ</w:t>
+            </w:r>
+            <w:r>
+              <w:rPr>
+                <w:rFonts w:ascii="BRH Malayalam Extra" w:hAnsi="BRH Malayalam Extra" w:cs="BRH Devanagari Extra"/>
+                <w:color w:val="000000"/>
+                <w:szCs w:val="40"/>
+              </w:rPr>
+              <w:t>–</w:t>
+            </w:r>
+            <w:r>
+              <w:rPr>
+                <w:rFonts w:ascii="BRH Devanagari Extra" w:hAnsi="BRH Devanagari Extra" w:cs="BRH Devanagari Extra"/>
+                <w:color w:val="000000"/>
+                <w:sz w:val="32"/>
+                <w:szCs w:val="40"/>
+              </w:rPr>
+              <w:t>ÂkÉÉåþ UÉxÉSè UÉxÉcNÒû</w:t>
+            </w:r>
+            <w:r>
+              <w:rPr>
+                <w:rFonts w:ascii="BRH Malayalam Extra" w:hAnsi="BRH Malayalam Extra" w:cs="BRH Devanagari Extra"/>
+                <w:color w:val="000000"/>
+                <w:szCs w:val="40"/>
+              </w:rPr>
+              <w:t>–</w:t>
+            </w:r>
+            <w:r>
+              <w:rPr>
+                <w:rFonts w:ascii="BRH Devanagari Extra" w:hAnsi="BRH Devanagari Extra" w:cs="BRH Devanagari Extra"/>
+                <w:color w:val="000000"/>
+                <w:sz w:val="32"/>
+                <w:szCs w:val="40"/>
+              </w:rPr>
+              <w:t>ÂkÉþ ¶É</w:t>
+            </w:r>
+            <w:r>
+              <w:rPr>
+                <w:rFonts w:ascii="BRH Malayalam Extra" w:hAnsi="BRH Malayalam Extra" w:cs="BRH Devanagari Extra"/>
+                <w:color w:val="000000"/>
+                <w:szCs w:val="40"/>
+              </w:rPr>
+              <w:t>–</w:t>
+            </w:r>
+            <w:r>
+              <w:rPr>
+                <w:rFonts w:ascii="BRH Devanagari Extra" w:hAnsi="BRH Devanagari Extra" w:cs="BRH Devanagari Extra"/>
+                <w:color w:val="000000"/>
+                <w:sz w:val="32"/>
+                <w:szCs w:val="40"/>
+                <w:highlight w:val="green"/>
+              </w:rPr>
+              <w:t>lSìÉaÉëÉÿÈ</w:t>
+            </w:r>
+            <w:r>
+              <w:rPr>
+                <w:rFonts w:ascii="BRH Devanagari Extra" w:hAnsi="BRH Devanagari Extra" w:cs="BRH Devanagari Extra"/>
+                <w:color w:val="000000"/>
+                <w:sz w:val="32"/>
+                <w:szCs w:val="40"/>
+              </w:rPr>
+              <w:t xml:space="preserve"> | </w:t>
+            </w:r>
+          </w:p>
+          <w:p>
+            <w:pPr>
+              <w:widowControl w:val="0"/>
+              <w:autoSpaceDE w:val="0"/>
+              <w:autoSpaceDN w:val="0"/>
+              <w:adjustRightInd w:val="0"/>
+              <w:rPr>
+                <w:rFonts w:ascii="BRH Devanagari Extra" w:hAnsi="BRH Devanagari Extra" w:cs="BRH Devanagari Extra"/>
+                <w:color w:val="000000"/>
+                <w:sz w:val="32"/>
+                <w:szCs w:val="40"/>
+              </w:rPr>
+            </w:pPr>
+            <w:r>
+              <w:rPr>
+                <w:rFonts w:cs="BRH Devanagari Extra"/>
+                <w:color w:val="000000"/>
+                <w:szCs w:val="40"/>
+              </w:rPr>
+              <w:t>36</w:t>
+            </w:r>
+            <w:r>
+              <w:rPr>
+                <w:rFonts w:ascii="BRH Devanagari Extra" w:hAnsi="BRH Devanagari Extra" w:cs="BRH Devanagari Extra"/>
+                <w:color w:val="000000"/>
+                <w:sz w:val="32"/>
+                <w:szCs w:val="40"/>
+              </w:rPr>
+              <w:t>)</w:t>
+            </w:r>
+            <w:r>
+              <w:rPr>
+                <w:rFonts w:ascii="BRH Devanagari Extra" w:hAnsi="BRH Devanagari Extra" w:cs="BRH Devanagari Extra"/>
+                <w:color w:val="000000"/>
+                <w:sz w:val="32"/>
+                <w:szCs w:val="40"/>
+              </w:rPr>
+              <w:tab/>
+            </w:r>
+            <w:r>
+              <w:rPr>
+                <w:rFonts w:cs="BRH Devanagari Extra"/>
+                <w:color w:val="000000"/>
+                <w:szCs w:val="40"/>
+              </w:rPr>
+              <w:t>1</w:t>
+            </w:r>
+            <w:r>
+              <w:rPr>
+                <w:rFonts w:ascii="BRH Devanagari Extra" w:hAnsi="BRH Devanagari Extra" w:cs="BRH Devanagari Extra"/>
+                <w:color w:val="000000"/>
+                <w:sz w:val="32"/>
+                <w:szCs w:val="40"/>
+              </w:rPr>
+              <w:t>.</w:t>
+            </w:r>
+            <w:r>
+              <w:rPr>
+                <w:rFonts w:cs="BRH Devanagari Extra"/>
+                <w:color w:val="000000"/>
+                <w:szCs w:val="40"/>
+              </w:rPr>
+              <w:t>1</w:t>
+            </w:r>
+            <w:r>
+              <w:rPr>
+                <w:rFonts w:ascii="BRH Devanagari Extra" w:hAnsi="BRH Devanagari Extra" w:cs="BRH Devanagari Extra"/>
+                <w:color w:val="000000"/>
+                <w:sz w:val="32"/>
+                <w:szCs w:val="40"/>
+              </w:rPr>
+              <w:t>.</w:t>
+            </w:r>
+            <w:r>
+              <w:rPr>
+                <w:rFonts w:cs="BRH Devanagari Extra"/>
+                <w:color w:val="000000"/>
+                <w:szCs w:val="40"/>
+              </w:rPr>
+              <w:t>14</w:t>
+            </w:r>
+            <w:r>
+              <w:rPr>
+                <w:rFonts w:ascii="BRH Devanagari Extra" w:hAnsi="BRH Devanagari Extra" w:cs="BRH Devanagari Extra"/>
+                <w:color w:val="000000"/>
+                <w:sz w:val="32"/>
+                <w:szCs w:val="40"/>
+              </w:rPr>
+              <w:t>.</w:t>
+            </w:r>
+            <w:r>
+              <w:rPr>
+                <w:rFonts w:cs="BRH Devanagari Extra"/>
+                <w:color w:val="000000"/>
+                <w:szCs w:val="40"/>
+              </w:rPr>
+              <w:t>2</w:t>
+            </w:r>
+            <w:r>
+              <w:rPr>
+                <w:rFonts w:ascii="BRH Devanagari Extra" w:hAnsi="BRH Devanagari Extra" w:cs="BRH Devanagari Extra"/>
+                <w:color w:val="000000"/>
+                <w:sz w:val="32"/>
+                <w:szCs w:val="40"/>
+              </w:rPr>
+              <w:t>(</w:t>
+            </w:r>
+            <w:r>
+              <w:rPr>
+                <w:rFonts w:cs="BRH Devanagari Extra"/>
+                <w:color w:val="000000"/>
+                <w:szCs w:val="40"/>
+              </w:rPr>
+              <w:t>33</w:t>
+            </w:r>
+            <w:r>
+              <w:rPr>
+                <w:rFonts w:ascii="BRH Devanagari Extra" w:hAnsi="BRH Devanagari Extra" w:cs="BRH Devanagari Extra"/>
+                <w:color w:val="000000"/>
+                <w:sz w:val="32"/>
+                <w:szCs w:val="40"/>
+              </w:rPr>
+              <w:t>)- zÉÑ</w:t>
+            </w:r>
+            <w:r>
+              <w:rPr>
+                <w:rFonts w:ascii="BRH Malayalam Extra" w:hAnsi="BRH Malayalam Extra" w:cs="BRH Devanagari Extra"/>
+                <w:color w:val="000000"/>
+                <w:szCs w:val="40"/>
+              </w:rPr>
+              <w:t>–</w:t>
+            </w:r>
+            <w:r>
+              <w:rPr>
+                <w:rFonts w:ascii="BRH Devanagari Extra" w:hAnsi="BRH Devanagari Extra" w:cs="BRH Devanagari Extra"/>
+                <w:color w:val="000000"/>
+                <w:sz w:val="32"/>
+                <w:szCs w:val="40"/>
+              </w:rPr>
+              <w:t>ÂkÉþÈ | cÉ</w:t>
+            </w:r>
+            <w:r>
+              <w:rPr>
+                <w:rFonts w:ascii="BRH Malayalam Extra" w:hAnsi="BRH Malayalam Extra" w:cs="BRH Devanagari Extra"/>
+                <w:color w:val="000000"/>
+                <w:szCs w:val="40"/>
+              </w:rPr>
+              <w:t>–</w:t>
+            </w:r>
+            <w:r>
+              <w:rPr>
+                <w:rFonts w:ascii="BRH Devanagari Extra" w:hAnsi="BRH Devanagari Extra" w:cs="BRH Devanagari Extra"/>
+                <w:color w:val="000000"/>
+                <w:sz w:val="32"/>
+                <w:szCs w:val="40"/>
+                <w:highlight w:val="green"/>
+              </w:rPr>
+              <w:t>lSìÉaÉëÉ</w:t>
+            </w:r>
+            <w:r>
+              <w:rPr>
+                <w:rFonts w:ascii="BRH Devanagari Extra" w:hAnsi="BRH Devanagari Extra" w:cs="BRH Devanagari Extra"/>
+                <w:color w:val="000000"/>
+                <w:sz w:val="32"/>
+                <w:szCs w:val="40"/>
+                <w:highlight w:val="yellow"/>
+              </w:rPr>
+              <w:t>ÿ</w:t>
+            </w:r>
+            <w:r>
+              <w:rPr>
+                <w:rFonts w:ascii="BRH Devanagari Extra" w:hAnsi="BRH Devanagari Extra" w:cs="BRH Devanagari Extra"/>
+                <w:color w:val="000000"/>
+                <w:sz w:val="32"/>
+                <w:szCs w:val="40"/>
+              </w:rPr>
+              <w:t>È | ÍkÉrÉþÎlkÉrÉqÉç |</w:t>
+            </w:r>
+          </w:p>
+          <w:p>
+            <w:pPr>
+              <w:widowControl w:val="0"/>
+              <w:autoSpaceDE w:val="0"/>
+              <w:autoSpaceDN w:val="0"/>
+              <w:adjustRightInd w:val="0"/>
+              <w:rPr>
+                <w:rFonts w:ascii="BRH Devanagari Extra" w:hAnsi="BRH Devanagari Extra" w:cs="BRH Devanagari Extra"/>
+                <w:color w:val="000000"/>
+                <w:sz w:val="32"/>
+                <w:szCs w:val="40"/>
+              </w:rPr>
+            </w:pPr>
+            <w:r>
+              <w:rPr>
+                <w:rFonts w:ascii="BRH Devanagari Extra" w:hAnsi="BRH Devanagari Extra" w:cs="BRH Devanagari Extra"/>
+                <w:color w:val="000000"/>
+                <w:sz w:val="32"/>
+                <w:szCs w:val="40"/>
+              </w:rPr>
+              <w:t>zÉÑ</w:t>
+            </w:r>
+            <w:r>
+              <w:rPr>
+                <w:rFonts w:ascii="BRH Malayalam Extra" w:hAnsi="BRH Malayalam Extra" w:cs="BRH Devanagari Extra"/>
+                <w:color w:val="000000"/>
+                <w:szCs w:val="40"/>
+              </w:rPr>
+              <w:t>–</w:t>
+            </w:r>
+            <w:r>
+              <w:rPr>
+                <w:rFonts w:ascii="BRH Devanagari Extra" w:hAnsi="BRH Devanagari Extra" w:cs="BRH Devanagari Extra"/>
+                <w:color w:val="000000"/>
+                <w:sz w:val="32"/>
+                <w:szCs w:val="40"/>
+              </w:rPr>
+              <w:t>ÂkÉþ ¶É</w:t>
+            </w:r>
+            <w:r>
+              <w:rPr>
+                <w:rFonts w:ascii="BRH Malayalam Extra" w:hAnsi="BRH Malayalam Extra" w:cs="BRH Devanagari Extra"/>
+                <w:color w:val="000000"/>
+                <w:szCs w:val="40"/>
+              </w:rPr>
+              <w:t>–</w:t>
+            </w:r>
+            <w:r>
+              <w:rPr>
+                <w:rFonts w:ascii="BRH Devanagari Extra" w:hAnsi="BRH Devanagari Extra" w:cs="BRH Devanagari Extra"/>
+                <w:color w:val="000000"/>
+                <w:sz w:val="32"/>
+                <w:szCs w:val="40"/>
+                <w:highlight w:val="green"/>
+              </w:rPr>
+              <w:t>lSìÉaÉëÉÿ</w:t>
+            </w:r>
+            <w:r>
+              <w:rPr>
+                <w:rFonts w:ascii="BRH Devanagari Extra" w:hAnsi="BRH Devanagari Extra" w:cs="BRH Devanagari Extra"/>
+                <w:color w:val="000000"/>
+                <w:sz w:val="32"/>
+                <w:szCs w:val="40"/>
+              </w:rPr>
+              <w:t xml:space="preserve"> ¶É</w:t>
+            </w:r>
+            <w:r>
+              <w:rPr>
+                <w:rFonts w:ascii="BRH Malayalam Extra" w:hAnsi="BRH Malayalam Extra" w:cs="BRH Devanagari Extra"/>
+                <w:color w:val="000000"/>
+                <w:szCs w:val="40"/>
+              </w:rPr>
+              <w:t>–</w:t>
+            </w:r>
+            <w:r>
+              <w:rPr>
+                <w:rFonts w:ascii="BRH Devanagari Extra" w:hAnsi="BRH Devanagari Extra" w:cs="BRH Devanagari Extra"/>
+                <w:color w:val="000000"/>
+                <w:sz w:val="32"/>
+                <w:szCs w:val="40"/>
+                <w:highlight w:val="green"/>
+              </w:rPr>
+              <w:t>lSìÉaÉëÉÿÈ</w:t>
+            </w:r>
+            <w:r>
+              <w:rPr>
+                <w:rFonts w:ascii="BRH Devanagari Extra" w:hAnsi="BRH Devanagari Extra" w:cs="BRH Devanagari Extra"/>
+                <w:color w:val="000000"/>
+                <w:sz w:val="32"/>
+                <w:szCs w:val="40"/>
+              </w:rPr>
+              <w:t xml:space="preserve"> zÉÑ</w:t>
+            </w:r>
+            <w:r>
+              <w:rPr>
+                <w:rFonts w:ascii="BRH Malayalam Extra" w:hAnsi="BRH Malayalam Extra" w:cs="BRH Devanagari Extra"/>
+                <w:color w:val="000000"/>
+                <w:szCs w:val="40"/>
+              </w:rPr>
+              <w:t>–</w:t>
+            </w:r>
+            <w:r>
+              <w:rPr>
+                <w:rFonts w:ascii="BRH Devanagari Extra" w:hAnsi="BRH Devanagari Extra" w:cs="BRH Devanagari Extra"/>
+                <w:color w:val="000000"/>
+                <w:sz w:val="32"/>
+                <w:szCs w:val="40"/>
+              </w:rPr>
+              <w:t>ÂkÉþÈ zÉÑ</w:t>
+            </w:r>
+            <w:r>
+              <w:rPr>
+                <w:rFonts w:ascii="BRH Malayalam Extra" w:hAnsi="BRH Malayalam Extra" w:cs="BRH Devanagari Extra"/>
+                <w:color w:val="000000"/>
+                <w:szCs w:val="40"/>
+              </w:rPr>
+              <w:t>–</w:t>
+            </w:r>
+            <w:r>
+              <w:rPr>
+                <w:rFonts w:ascii="BRH Devanagari Extra" w:hAnsi="BRH Devanagari Extra" w:cs="BRH Devanagari Extra"/>
+                <w:color w:val="000000"/>
+                <w:sz w:val="32"/>
+                <w:szCs w:val="40"/>
+              </w:rPr>
+              <w:t>ÂkÉþ ¶É</w:t>
+            </w:r>
+            <w:r>
+              <w:rPr>
+                <w:rFonts w:ascii="BRH Malayalam Extra" w:hAnsi="BRH Malayalam Extra" w:cs="BRH Devanagari Extra"/>
+                <w:color w:val="000000"/>
+                <w:szCs w:val="40"/>
+              </w:rPr>
+              <w:t>–</w:t>
+            </w:r>
+            <w:r>
+              <w:rPr>
+                <w:rFonts w:ascii="BRH Devanagari Extra" w:hAnsi="BRH Devanagari Extra" w:cs="BRH Devanagari Extra"/>
+                <w:color w:val="000000"/>
+                <w:sz w:val="32"/>
+                <w:szCs w:val="40"/>
+                <w:highlight w:val="green"/>
+              </w:rPr>
+              <w:t>lSìÉ</w:t>
+            </w:r>
+            <w:r>
+              <w:rPr>
+                <w:rFonts w:ascii="BRH Devanagari Extra" w:hAnsi="BRH Devanagari Extra" w:cs="BRH Devanagari Extra"/>
+                <w:color w:val="000000"/>
+                <w:sz w:val="32"/>
+                <w:szCs w:val="40"/>
+              </w:rPr>
+              <w:t>aÉëÉ</w:t>
+            </w:r>
+            <w:r>
+              <w:rPr>
+                <w:rFonts w:ascii="BRH Malayalam Extra" w:hAnsi="BRH Malayalam Extra" w:cs="BRH Devanagari Extra"/>
+                <w:color w:val="000000"/>
+                <w:szCs w:val="40"/>
+              </w:rPr>
+              <w:t>–</w:t>
+            </w:r>
+            <w:r>
+              <w:rPr>
+                <w:rFonts w:ascii="BRH Devanagari Extra" w:hAnsi="BRH Devanagari Extra" w:cs="BRH Devanagari Extra"/>
+                <w:color w:val="000000"/>
+                <w:sz w:val="32"/>
+                <w:szCs w:val="40"/>
+              </w:rPr>
+              <w:t xml:space="preserve"> </w:t>
+            </w:r>
+          </w:p>
+          <w:p>
+            <w:pPr>
+              <w:widowControl w:val="0"/>
+              <w:autoSpaceDE w:val="0"/>
+              <w:autoSpaceDN w:val="0"/>
+              <w:adjustRightInd w:val="0"/>
+              <w:rPr>
+                <w:rFonts w:ascii="BRH Devanagari Extra" w:hAnsi="BRH Devanagari Extra" w:cs="BRH Devanagari Extra"/>
+                <w:color w:val="000000"/>
+                <w:sz w:val="32"/>
+                <w:szCs w:val="40"/>
+              </w:rPr>
+            </w:pPr>
+            <w:r>
+              <w:rPr>
+                <w:rFonts w:ascii="BRH Devanagari Extra" w:hAnsi="BRH Devanagari Extra" w:cs="BRH Devanagari Extra"/>
+                <w:color w:val="000000"/>
+                <w:sz w:val="32"/>
+                <w:szCs w:val="40"/>
+              </w:rPr>
+              <w:t>ÍkÉrÉþÎlkÉrÉ</w:t>
+            </w:r>
+            <w:r>
+              <w:rPr>
+                <w:rFonts w:ascii="BRH Malayalam Extra" w:hAnsi="BRH Malayalam Extra" w:cs="BRH Devanagari Extra"/>
+                <w:color w:val="000000"/>
+                <w:szCs w:val="40"/>
+              </w:rPr>
+              <w:t>–</w:t>
+            </w:r>
+            <w:r>
+              <w:rPr>
+                <w:rFonts w:ascii="BRH Devanagari Extra" w:hAnsi="BRH Devanagari Extra" w:cs="BRH Devanagari Extra"/>
+                <w:color w:val="000000"/>
+                <w:sz w:val="32"/>
+                <w:szCs w:val="40"/>
+              </w:rPr>
+              <w:t>qÉç ÍkÉrÉþÎlkÉrÉqÉç cÉ</w:t>
+            </w:r>
+            <w:r>
+              <w:rPr>
+                <w:rFonts w:ascii="BRH Malayalam Extra" w:hAnsi="BRH Malayalam Extra" w:cs="BRH Devanagari Extra"/>
+                <w:color w:val="000000"/>
+                <w:szCs w:val="40"/>
+              </w:rPr>
+              <w:t>–</w:t>
+            </w:r>
+            <w:r>
+              <w:rPr>
+                <w:rFonts w:ascii="BRH Devanagari Extra" w:hAnsi="BRH Devanagari Extra" w:cs="BRH Devanagari Extra"/>
+                <w:color w:val="000000"/>
+                <w:sz w:val="32"/>
+                <w:szCs w:val="40"/>
+                <w:highlight w:val="green"/>
+              </w:rPr>
+              <w:t>lSìÉaÉëÉÿÈ</w:t>
+            </w:r>
+            <w:r>
+              <w:rPr>
+                <w:rFonts w:ascii="BRH Devanagari Extra" w:hAnsi="BRH Devanagari Extra" w:cs="BRH Devanagari Extra"/>
+                <w:color w:val="000000"/>
+                <w:sz w:val="32"/>
+                <w:szCs w:val="40"/>
+              </w:rPr>
+              <w:t xml:space="preserve"> zÉÑ</w:t>
+            </w:r>
+            <w:r>
+              <w:rPr>
+                <w:rFonts w:ascii="BRH Malayalam Extra" w:hAnsi="BRH Malayalam Extra" w:cs="BRH Devanagari Extra"/>
+                <w:color w:val="000000"/>
+                <w:szCs w:val="40"/>
+              </w:rPr>
+              <w:t>–</w:t>
+            </w:r>
+            <w:r>
+              <w:rPr>
+                <w:rFonts w:ascii="BRH Devanagari Extra" w:hAnsi="BRH Devanagari Extra" w:cs="BRH Devanagari Extra"/>
+                <w:color w:val="000000"/>
+                <w:sz w:val="32"/>
+                <w:szCs w:val="40"/>
+              </w:rPr>
+              <w:t>ÂkÉþÈ zÉÑ</w:t>
+            </w:r>
+            <w:r>
+              <w:rPr>
+                <w:rFonts w:ascii="BRH Malayalam Extra" w:hAnsi="BRH Malayalam Extra" w:cs="BRH Devanagari Extra"/>
+                <w:color w:val="000000"/>
+                <w:szCs w:val="40"/>
+              </w:rPr>
+              <w:t>–</w:t>
+            </w:r>
+            <w:r>
+              <w:rPr>
+                <w:rFonts w:ascii="BRH Devanagari Extra" w:hAnsi="BRH Devanagari Extra" w:cs="BRH Devanagari Extra"/>
+                <w:color w:val="000000"/>
+                <w:sz w:val="32"/>
+                <w:szCs w:val="40"/>
+              </w:rPr>
+              <w:t xml:space="preserve">ÂkÉþ </w:t>
+            </w:r>
+          </w:p>
+          <w:p>
+            <w:pPr>
+              <w:widowControl w:val="0"/>
+              <w:autoSpaceDE w:val="0"/>
+              <w:autoSpaceDN w:val="0"/>
+              <w:adjustRightInd w:val="0"/>
+              <w:rPr>
+                <w:rFonts w:ascii="BRH Devanagari Extra" w:hAnsi="BRH Devanagari Extra" w:cs="BRH Devanagari Extra"/>
+                <w:color w:val="000000"/>
+                <w:sz w:val="32"/>
+                <w:szCs w:val="40"/>
+              </w:rPr>
+            </w:pPr>
+            <w:r>
+              <w:rPr>
+                <w:rFonts w:ascii="BRH Devanagari Extra" w:hAnsi="BRH Devanagari Extra" w:cs="BRH Devanagari Extra"/>
+                <w:color w:val="000000"/>
+                <w:sz w:val="32"/>
+                <w:szCs w:val="40"/>
+              </w:rPr>
+              <w:t>¶É</w:t>
+            </w:r>
+            <w:r>
+              <w:rPr>
+                <w:rFonts w:ascii="BRH Malayalam Extra" w:hAnsi="BRH Malayalam Extra" w:cs="BRH Devanagari Extra"/>
+                <w:color w:val="000000"/>
+                <w:szCs w:val="40"/>
+                <w:highlight w:val="green"/>
+              </w:rPr>
+              <w:t>–</w:t>
+            </w:r>
+            <w:r>
+              <w:rPr>
+                <w:rFonts w:ascii="BRH Devanagari Extra" w:hAnsi="BRH Devanagari Extra" w:cs="BRH Devanagari Extra"/>
+                <w:color w:val="000000"/>
+                <w:sz w:val="32"/>
+                <w:szCs w:val="40"/>
+                <w:highlight w:val="green"/>
+              </w:rPr>
+              <w:t>lSìÉ</w:t>
+            </w:r>
+            <w:r>
+              <w:rPr>
+                <w:rFonts w:ascii="BRH Devanagari Extra" w:hAnsi="BRH Devanagari Extra" w:cs="BRH Devanagari Extra"/>
+                <w:color w:val="000000"/>
+                <w:sz w:val="32"/>
+                <w:szCs w:val="40"/>
+              </w:rPr>
+              <w:t>aÉëÉ</w:t>
+            </w:r>
+            <w:r>
+              <w:rPr>
+                <w:rFonts w:ascii="BRH Malayalam Extra" w:hAnsi="BRH Malayalam Extra" w:cs="BRH Devanagari Extra"/>
+                <w:color w:val="000000"/>
+                <w:szCs w:val="40"/>
+              </w:rPr>
+              <w:t>–</w:t>
+            </w:r>
+            <w:r>
+              <w:rPr>
+                <w:rFonts w:ascii="BRH Devanagari Extra" w:hAnsi="BRH Devanagari Extra" w:cs="BRH Devanagari Extra"/>
+                <w:color w:val="000000"/>
+                <w:sz w:val="32"/>
+                <w:szCs w:val="40"/>
+              </w:rPr>
+              <w:t xml:space="preserve"> ÍkÉrÉþÎlkÉrÉqÉç | </w:t>
+            </w:r>
+          </w:p>
+          <w:p>
+            <w:pPr>
+              <w:widowControl w:val="0"/>
+              <w:autoSpaceDE w:val="0"/>
+              <w:autoSpaceDN w:val="0"/>
+              <w:adjustRightInd w:val="0"/>
+              <w:rPr>
+                <w:rFonts w:ascii="BRH Devanagari Extra" w:hAnsi="BRH Devanagari Extra" w:cs="BRH Devanagari Extra"/>
+                <w:color w:val="000000"/>
+                <w:sz w:val="32"/>
+                <w:szCs w:val="40"/>
+              </w:rPr>
+            </w:pPr>
+            <w:r>
+              <w:rPr>
+                <w:rFonts w:cs="BRH Devanagari Extra"/>
+                <w:color w:val="000000"/>
+                <w:szCs w:val="40"/>
+              </w:rPr>
+              <w:t>37</w:t>
+            </w:r>
+            <w:r>
+              <w:rPr>
+                <w:rFonts w:ascii="BRH Devanagari Extra" w:hAnsi="BRH Devanagari Extra" w:cs="BRH Devanagari Extra"/>
+                <w:color w:val="000000"/>
+                <w:sz w:val="32"/>
+                <w:szCs w:val="40"/>
+              </w:rPr>
+              <w:t>)</w:t>
+            </w:r>
+            <w:r>
+              <w:rPr>
+                <w:rFonts w:ascii="BRH Devanagari Extra" w:hAnsi="BRH Devanagari Extra" w:cs="BRH Devanagari Extra"/>
+                <w:color w:val="000000"/>
+                <w:sz w:val="32"/>
+                <w:szCs w:val="40"/>
+              </w:rPr>
+              <w:tab/>
+            </w:r>
+            <w:r>
+              <w:rPr>
+                <w:rFonts w:cs="BRH Devanagari Extra"/>
+                <w:color w:val="000000"/>
+                <w:szCs w:val="40"/>
+              </w:rPr>
+              <w:t>1</w:t>
+            </w:r>
+            <w:r>
+              <w:rPr>
+                <w:rFonts w:ascii="BRH Devanagari Extra" w:hAnsi="BRH Devanagari Extra" w:cs="BRH Devanagari Extra"/>
+                <w:color w:val="000000"/>
+                <w:sz w:val="32"/>
+                <w:szCs w:val="40"/>
+              </w:rPr>
+              <w:t>.</w:t>
+            </w:r>
+            <w:r>
+              <w:rPr>
+                <w:rFonts w:cs="BRH Devanagari Extra"/>
+                <w:color w:val="000000"/>
+                <w:szCs w:val="40"/>
+              </w:rPr>
+              <w:t>1</w:t>
+            </w:r>
+            <w:r>
+              <w:rPr>
+                <w:rFonts w:ascii="BRH Devanagari Extra" w:hAnsi="BRH Devanagari Extra" w:cs="BRH Devanagari Extra"/>
+                <w:color w:val="000000"/>
+                <w:sz w:val="32"/>
+                <w:szCs w:val="40"/>
+              </w:rPr>
+              <w:t>.</w:t>
+            </w:r>
+            <w:r>
+              <w:rPr>
+                <w:rFonts w:cs="BRH Devanagari Extra"/>
+                <w:color w:val="000000"/>
+                <w:szCs w:val="40"/>
+              </w:rPr>
+              <w:t>14</w:t>
+            </w:r>
+            <w:r>
+              <w:rPr>
+                <w:rFonts w:ascii="BRH Devanagari Extra" w:hAnsi="BRH Devanagari Extra" w:cs="BRH Devanagari Extra"/>
+                <w:color w:val="000000"/>
+                <w:sz w:val="32"/>
+                <w:szCs w:val="40"/>
+              </w:rPr>
+              <w:t>.</w:t>
+            </w:r>
+            <w:r>
+              <w:rPr>
+                <w:rFonts w:cs="BRH Devanagari Extra"/>
+                <w:color w:val="000000"/>
+                <w:szCs w:val="40"/>
+              </w:rPr>
+              <w:t>2</w:t>
+            </w:r>
+            <w:r>
+              <w:rPr>
+                <w:rFonts w:ascii="BRH Devanagari Extra" w:hAnsi="BRH Devanagari Extra" w:cs="BRH Devanagari Extra"/>
+                <w:color w:val="000000"/>
+                <w:sz w:val="32"/>
+                <w:szCs w:val="40"/>
+              </w:rPr>
+              <w:t>(</w:t>
+            </w:r>
+            <w:r>
+              <w:rPr>
+                <w:rFonts w:cs="BRH Devanagari Extra"/>
+                <w:color w:val="000000"/>
+                <w:szCs w:val="40"/>
+              </w:rPr>
+              <w:t>34</w:t>
+            </w:r>
+            <w:r>
+              <w:rPr>
+                <w:rFonts w:ascii="BRH Devanagari Extra" w:hAnsi="BRH Devanagari Extra" w:cs="BRH Devanagari Extra"/>
+                <w:color w:val="000000"/>
+                <w:sz w:val="32"/>
+                <w:szCs w:val="40"/>
+              </w:rPr>
+              <w:t>)- cÉ</w:t>
+            </w:r>
+            <w:r>
+              <w:rPr>
+                <w:rFonts w:ascii="BRH Malayalam Extra" w:hAnsi="BRH Malayalam Extra" w:cs="BRH Devanagari Extra"/>
+                <w:color w:val="000000"/>
+                <w:szCs w:val="40"/>
+              </w:rPr>
+              <w:t>–</w:t>
+            </w:r>
+            <w:r>
+              <w:rPr>
+                <w:rFonts w:ascii="BRH Devanagari Extra" w:hAnsi="BRH Devanagari Extra" w:cs="BRH Devanagari Extra"/>
+                <w:color w:val="000000"/>
+                <w:sz w:val="32"/>
+                <w:szCs w:val="40"/>
+                <w:highlight w:val="green"/>
+              </w:rPr>
+              <w:t>lSìÉaÉëÉ</w:t>
+            </w:r>
+            <w:r>
+              <w:rPr>
+                <w:rFonts w:ascii="BRH Devanagari Extra" w:hAnsi="BRH Devanagari Extra" w:cs="BRH Devanagari Extra"/>
+                <w:color w:val="000000"/>
+                <w:sz w:val="32"/>
+                <w:szCs w:val="40"/>
+                <w:highlight w:val="yellow"/>
+              </w:rPr>
+              <w:t>ÿ</w:t>
+            </w:r>
+            <w:r>
+              <w:rPr>
+                <w:rFonts w:ascii="BRH Devanagari Extra" w:hAnsi="BRH Devanagari Extra" w:cs="BRH Devanagari Extra"/>
+                <w:color w:val="000000"/>
+                <w:sz w:val="32"/>
+                <w:szCs w:val="40"/>
+              </w:rPr>
+              <w:t>È | ÍkÉrÉþÎlkÉrÉqÉç | xÉÏ</w:t>
+            </w:r>
+            <w:r>
+              <w:rPr>
+                <w:rFonts w:ascii="BRH Malayalam Extra" w:hAnsi="BRH Malayalam Extra" w:cs="BRH Devanagari Extra"/>
+                <w:color w:val="000000"/>
+                <w:szCs w:val="40"/>
+              </w:rPr>
+              <w:t>–</w:t>
+            </w:r>
+            <w:r>
+              <w:rPr>
+                <w:rFonts w:ascii="BRH Devanagari Extra" w:hAnsi="BRH Devanagari Extra" w:cs="BRH Devanagari Extra"/>
+                <w:color w:val="000000"/>
+                <w:sz w:val="32"/>
+                <w:szCs w:val="40"/>
+              </w:rPr>
+              <w:t>wÉ</w:t>
+            </w:r>
+            <w:r>
+              <w:rPr>
+                <w:rFonts w:ascii="BRH Malayalam Extra" w:hAnsi="BRH Malayalam Extra" w:cs="BRH Devanagari Extra"/>
+                <w:color w:val="000000"/>
+                <w:szCs w:val="40"/>
+              </w:rPr>
+              <w:t>–</w:t>
+            </w:r>
+            <w:r>
+              <w:rPr>
+                <w:rFonts w:ascii="BRH Devanagari Extra" w:hAnsi="BRH Devanagari Extra" w:cs="BRH Devanagari Extra"/>
+                <w:color w:val="000000"/>
+                <w:sz w:val="32"/>
+                <w:szCs w:val="40"/>
+              </w:rPr>
+              <w:t>kÉÉ</w:t>
+            </w:r>
+            <w:r>
+              <w:rPr>
+                <w:rFonts w:ascii="BRH Malayalam Extra" w:hAnsi="BRH Malayalam Extra" w:cs="BRH Devanagari Extra"/>
+                <w:color w:val="000000"/>
+                <w:szCs w:val="40"/>
+              </w:rPr>
+              <w:t>–</w:t>
+            </w:r>
+            <w:r>
+              <w:rPr>
+                <w:rFonts w:ascii="BRH Devanagari Extra" w:hAnsi="BRH Devanagari Extra" w:cs="BRH Devanagari Extra"/>
+                <w:color w:val="000000"/>
+                <w:sz w:val="32"/>
+                <w:szCs w:val="40"/>
+              </w:rPr>
+              <w:t>ÌiÉ</w:t>
+            </w:r>
+            <w:r>
+              <w:rPr>
+                <w:rFonts w:ascii="BRH Malayalam Extra" w:hAnsi="BRH Malayalam Extra" w:cs="BRH Devanagari Extra"/>
+                <w:color w:val="000000"/>
+                <w:szCs w:val="40"/>
+              </w:rPr>
+              <w:t>–</w:t>
+            </w:r>
+            <w:r>
+              <w:rPr>
+                <w:rFonts w:ascii="BRH Devanagari Extra" w:hAnsi="BRH Devanagari Extra" w:cs="BRH Devanagari Extra"/>
+                <w:color w:val="000000"/>
+                <w:sz w:val="32"/>
+                <w:szCs w:val="40"/>
+              </w:rPr>
+              <w:t xml:space="preserve"> |</w:t>
+            </w:r>
+          </w:p>
+          <w:p>
+            <w:pPr>
+              <w:widowControl w:val="0"/>
+              <w:autoSpaceDE w:val="0"/>
+              <w:autoSpaceDN w:val="0"/>
+              <w:adjustRightInd w:val="0"/>
+              <w:rPr>
+                <w:rFonts w:ascii="BRH Devanagari Extra" w:hAnsi="BRH Devanagari Extra" w:cs="BRH Devanagari Extra"/>
+                <w:color w:val="000000"/>
+                <w:sz w:val="32"/>
+                <w:szCs w:val="40"/>
+              </w:rPr>
+            </w:pPr>
+            <w:r>
+              <w:rPr>
+                <w:rFonts w:ascii="BRH Devanagari Extra" w:hAnsi="BRH Devanagari Extra" w:cs="BRH Devanagari Extra"/>
+                <w:color w:val="000000"/>
+                <w:sz w:val="32"/>
+                <w:szCs w:val="40"/>
+              </w:rPr>
+              <w:t>cÉ</w:t>
+            </w:r>
+            <w:r>
+              <w:rPr>
+                <w:rFonts w:ascii="BRH Malayalam Extra" w:hAnsi="BRH Malayalam Extra" w:cs="BRH Devanagari Extra"/>
+                <w:color w:val="000000"/>
+                <w:szCs w:val="40"/>
+              </w:rPr>
+              <w:t>–</w:t>
+            </w:r>
+            <w:r>
+              <w:rPr>
+                <w:rFonts w:ascii="BRH Devanagari Extra" w:hAnsi="BRH Devanagari Extra" w:cs="BRH Devanagari Extra"/>
+                <w:color w:val="000000"/>
+                <w:sz w:val="32"/>
+                <w:szCs w:val="40"/>
+                <w:highlight w:val="green"/>
+              </w:rPr>
+              <w:t>lSìÉ</w:t>
+            </w:r>
+            <w:r>
+              <w:rPr>
+                <w:rFonts w:ascii="BRH Devanagari Extra" w:hAnsi="BRH Devanagari Extra" w:cs="BRH Devanagari Extra"/>
+                <w:color w:val="000000"/>
+                <w:sz w:val="32"/>
+                <w:szCs w:val="40"/>
+              </w:rPr>
+              <w:t>aÉëÉ</w:t>
+            </w:r>
+            <w:r>
+              <w:rPr>
+                <w:rFonts w:ascii="BRH Malayalam Extra" w:hAnsi="BRH Malayalam Extra" w:cs="BRH Devanagari Extra"/>
+                <w:color w:val="000000"/>
+                <w:szCs w:val="40"/>
+              </w:rPr>
+              <w:t>–</w:t>
+            </w:r>
+            <w:r>
+              <w:rPr>
+                <w:rFonts w:ascii="BRH Devanagari Extra" w:hAnsi="BRH Devanagari Extra" w:cs="BRH Devanagari Extra"/>
+                <w:color w:val="000000"/>
+                <w:sz w:val="32"/>
+                <w:szCs w:val="40"/>
+              </w:rPr>
+              <w:t xml:space="preserve"> ÍkÉrÉþÎlkÉrÉ</w:t>
+            </w:r>
+            <w:r>
+              <w:rPr>
+                <w:rFonts w:ascii="BRH Malayalam Extra" w:hAnsi="BRH Malayalam Extra" w:cs="BRH Devanagari Extra"/>
+                <w:color w:val="000000"/>
+                <w:szCs w:val="40"/>
+              </w:rPr>
+              <w:t>–</w:t>
+            </w:r>
+            <w:r>
+              <w:rPr>
+                <w:rFonts w:ascii="BRH Devanagari Extra" w:hAnsi="BRH Devanagari Extra" w:cs="BRH Devanagari Extra"/>
+                <w:color w:val="000000"/>
+                <w:sz w:val="32"/>
+                <w:szCs w:val="40"/>
+              </w:rPr>
+              <w:t>qÉç ÍkÉrÉþÎlkÉrÉqÉç cÉ</w:t>
+            </w:r>
+            <w:r>
+              <w:rPr>
+                <w:rFonts w:ascii="BRH Malayalam Extra" w:hAnsi="BRH Malayalam Extra" w:cs="BRH Devanagari Extra"/>
+                <w:color w:val="000000"/>
+                <w:szCs w:val="40"/>
+              </w:rPr>
+              <w:t>–</w:t>
+            </w:r>
+            <w:r>
+              <w:rPr>
+                <w:rFonts w:ascii="BRH Devanagari Extra" w:hAnsi="BRH Devanagari Extra" w:cs="BRH Devanagari Extra"/>
+                <w:color w:val="000000"/>
+                <w:sz w:val="32"/>
+                <w:szCs w:val="40"/>
+                <w:highlight w:val="green"/>
+              </w:rPr>
+              <w:t>lSìÉaÉëÉ</w:t>
+            </w:r>
+            <w:r>
+              <w:rPr>
+                <w:rFonts w:ascii="BRH Devanagari Extra" w:hAnsi="BRH Devanagari Extra" w:cs="BRH Devanagari Extra"/>
+                <w:color w:val="000000"/>
+                <w:sz w:val="32"/>
+                <w:szCs w:val="40"/>
+                <w:highlight w:val="yellow"/>
+              </w:rPr>
+              <w:t>ÿ</w:t>
+            </w:r>
+            <w:r>
+              <w:rPr>
+                <w:rFonts w:ascii="BRH Devanagari Extra" w:hAnsi="BRH Devanagari Extra" w:cs="BRH Devanagari Extra"/>
+                <w:color w:val="000000"/>
+                <w:sz w:val="32"/>
+                <w:szCs w:val="40"/>
+              </w:rPr>
+              <w:t xml:space="preserve"> ¶É</w:t>
+            </w:r>
+            <w:r>
+              <w:rPr>
+                <w:rFonts w:ascii="BRH Malayalam Extra" w:hAnsi="BRH Malayalam Extra" w:cs="BRH Devanagari Extra"/>
+                <w:color w:val="000000"/>
+                <w:szCs w:val="40"/>
+              </w:rPr>
+              <w:t>–</w:t>
+            </w:r>
+            <w:r>
+              <w:rPr>
+                <w:rFonts w:ascii="BRH Devanagari Extra" w:hAnsi="BRH Devanagari Extra" w:cs="BRH Devanagari Extra"/>
+                <w:color w:val="000000"/>
+                <w:sz w:val="32"/>
+                <w:szCs w:val="40"/>
+                <w:highlight w:val="green"/>
+              </w:rPr>
+              <w:t>lSìÉ</w:t>
+            </w:r>
+            <w:r>
+              <w:rPr>
+                <w:rFonts w:ascii="BRH Devanagari Extra" w:hAnsi="BRH Devanagari Extra" w:cs="BRH Devanagari Extra"/>
+                <w:color w:val="000000"/>
+                <w:sz w:val="32"/>
+                <w:szCs w:val="40"/>
+              </w:rPr>
+              <w:t>aÉëÉ</w:t>
+            </w:r>
+            <w:r>
+              <w:rPr>
+                <w:rFonts w:ascii="BRH Malayalam Extra" w:hAnsi="BRH Malayalam Extra" w:cs="BRH Devanagari Extra"/>
+                <w:color w:val="000000"/>
+                <w:szCs w:val="40"/>
+                <w:highlight w:val="yellow"/>
+              </w:rPr>
+              <w:t>–</w:t>
+            </w:r>
+            <w:r>
+              <w:rPr>
+                <w:rFonts w:ascii="BRH Devanagari Extra" w:hAnsi="BRH Devanagari Extra" w:cs="BRH Devanagari Extra"/>
+                <w:color w:val="000000"/>
+                <w:sz w:val="32"/>
+                <w:szCs w:val="40"/>
+              </w:rPr>
+              <w:t xml:space="preserve"> </w:t>
+            </w:r>
+          </w:p>
+          <w:p>
+            <w:pPr>
+              <w:widowControl w:val="0"/>
+              <w:autoSpaceDE w:val="0"/>
+              <w:autoSpaceDN w:val="0"/>
+              <w:adjustRightInd w:val="0"/>
+              <w:rPr>
+                <w:rFonts w:ascii="BRH Devanagari Extra" w:hAnsi="BRH Devanagari Extra" w:cs="BRH Devanagari Extra"/>
+                <w:color w:val="000000"/>
+                <w:sz w:val="32"/>
+                <w:szCs w:val="40"/>
+              </w:rPr>
+            </w:pPr>
+            <w:r>
+              <w:rPr>
+                <w:rFonts w:ascii="BRH Devanagari Extra" w:hAnsi="BRH Devanagari Extra" w:cs="BRH Devanagari Extra"/>
+                <w:color w:val="000000"/>
+                <w:sz w:val="32"/>
+                <w:szCs w:val="40"/>
+              </w:rPr>
+              <w:t>ÍkÉrÉþÎlkÉrÉ</w:t>
+            </w:r>
+            <w:r>
+              <w:rPr>
+                <w:rFonts w:ascii="BRH Devanagari Extra" w:hAnsi="BRH Devanagari Extra" w:cs="BRH Devanagari Extra"/>
+                <w:color w:val="000000"/>
+                <w:sz w:val="28"/>
+                <w:szCs w:val="40"/>
+              </w:rPr>
+              <w:t>óè</w:t>
+            </w:r>
+            <w:r>
+              <w:rPr>
+                <w:rFonts w:ascii="BRH Devanagari Extra" w:hAnsi="BRH Devanagari Extra" w:cs="BRH Devanagari Extra"/>
+                <w:color w:val="000000"/>
+                <w:sz w:val="32"/>
+                <w:szCs w:val="40"/>
+              </w:rPr>
+              <w:t xml:space="preserve"> xÉÏwÉkÉÉÌiÉ xÉÏwÉkÉÉÌiÉ</w:t>
+            </w:r>
+            <w:r>
+              <w:rPr>
+                <w:rFonts w:ascii="BRH Malayalam Extra" w:hAnsi="BRH Malayalam Extra" w:cs="BRH Devanagari Extra"/>
+                <w:color w:val="000000"/>
+                <w:szCs w:val="40"/>
+              </w:rPr>
+              <w:t>–</w:t>
+            </w:r>
+            <w:r>
+              <w:rPr>
+                <w:rFonts w:ascii="BRH Devanagari Extra" w:hAnsi="BRH Devanagari Extra" w:cs="BRH Devanagari Extra"/>
+                <w:color w:val="000000"/>
+                <w:sz w:val="32"/>
+                <w:szCs w:val="40"/>
+              </w:rPr>
+              <w:t xml:space="preserve"> ÍkÉrÉþÎlkÉrÉqÉç cÉ</w:t>
+            </w:r>
+            <w:r>
+              <w:rPr>
+                <w:rFonts w:ascii="BRH Malayalam Extra" w:hAnsi="BRH Malayalam Extra" w:cs="BRH Devanagari Extra"/>
+                <w:color w:val="000000"/>
+                <w:szCs w:val="40"/>
+              </w:rPr>
+              <w:t>–</w:t>
+            </w:r>
+            <w:r>
+              <w:rPr>
+                <w:rFonts w:ascii="BRH Devanagari Extra" w:hAnsi="BRH Devanagari Extra" w:cs="BRH Devanagari Extra"/>
+                <w:color w:val="000000"/>
+                <w:sz w:val="32"/>
+                <w:szCs w:val="40"/>
+                <w:highlight w:val="green"/>
+              </w:rPr>
+              <w:t>lSìÉaÉëÉÿ</w:t>
+            </w:r>
+            <w:r>
+              <w:rPr>
+                <w:rFonts w:ascii="BRH Devanagari Extra" w:hAnsi="BRH Devanagari Extra" w:cs="BRH Devanagari Extra"/>
+                <w:color w:val="000000"/>
+                <w:sz w:val="32"/>
+                <w:szCs w:val="40"/>
+              </w:rPr>
+              <w:t xml:space="preserve"> </w:t>
+            </w:r>
+          </w:p>
+          <w:p>
+            <w:pPr>
+              <w:widowControl w:val="0"/>
+              <w:autoSpaceDE w:val="0"/>
+              <w:autoSpaceDN w:val="0"/>
+              <w:adjustRightInd w:val="0"/>
+              <w:rPr>
+                <w:rFonts w:ascii="BRH Devanagari Extra" w:hAnsi="BRH Devanagari Extra" w:cs="BRH Devanagari Extra"/>
+                <w:color w:val="000000"/>
+                <w:sz w:val="32"/>
+                <w:szCs w:val="40"/>
+              </w:rPr>
+            </w:pPr>
+            <w:r>
+              <w:rPr>
+                <w:rFonts w:ascii="BRH Devanagari Extra" w:hAnsi="BRH Devanagari Extra" w:cs="BRH Devanagari Extra"/>
+                <w:color w:val="000000"/>
+                <w:sz w:val="32"/>
+                <w:szCs w:val="40"/>
+              </w:rPr>
+              <w:t>¶É</w:t>
+            </w:r>
+            <w:r>
+              <w:rPr>
+                <w:rFonts w:ascii="BRH Malayalam Extra" w:hAnsi="BRH Malayalam Extra" w:cs="BRH Devanagari Extra"/>
+                <w:color w:val="000000"/>
+                <w:szCs w:val="40"/>
+              </w:rPr>
+              <w:t>–</w:t>
+            </w:r>
+            <w:r>
+              <w:rPr>
+                <w:rFonts w:ascii="BRH Devanagari Extra" w:hAnsi="BRH Devanagari Extra" w:cs="BRH Devanagari Extra"/>
+                <w:color w:val="000000"/>
+                <w:sz w:val="32"/>
+                <w:szCs w:val="40"/>
+                <w:highlight w:val="green"/>
+              </w:rPr>
+              <w:t>lSìÉ</w:t>
+            </w:r>
+            <w:r>
+              <w:rPr>
+                <w:rFonts w:ascii="BRH Devanagari Extra" w:hAnsi="BRH Devanagari Extra" w:cs="BRH Devanagari Extra"/>
+                <w:color w:val="000000"/>
+                <w:sz w:val="32"/>
+                <w:szCs w:val="40"/>
+              </w:rPr>
+              <w:t>aÉëÉ</w:t>
+            </w:r>
+            <w:r>
+              <w:rPr>
+                <w:rFonts w:ascii="BRH Malayalam Extra" w:hAnsi="BRH Malayalam Extra" w:cs="BRH Devanagari Extra"/>
+                <w:color w:val="000000"/>
+                <w:szCs w:val="40"/>
+              </w:rPr>
+              <w:t>–</w:t>
+            </w:r>
+            <w:r>
+              <w:rPr>
+                <w:rFonts w:ascii="BRH Devanagari Extra" w:hAnsi="BRH Devanagari Extra" w:cs="BRH Devanagari Extra"/>
+                <w:color w:val="000000"/>
+                <w:sz w:val="32"/>
+                <w:szCs w:val="40"/>
+              </w:rPr>
+              <w:t xml:space="preserve"> ÍkÉrÉþÎlkÉrÉ</w:t>
+            </w:r>
+            <w:r>
+              <w:rPr>
+                <w:rFonts w:ascii="BRH Devanagari Extra" w:hAnsi="BRH Devanagari Extra" w:cs="BRH Devanagari Extra"/>
+                <w:color w:val="000000"/>
+                <w:sz w:val="28"/>
+                <w:szCs w:val="40"/>
+              </w:rPr>
+              <w:t>óè</w:t>
+            </w:r>
+            <w:r>
+              <w:rPr>
+                <w:rFonts w:ascii="BRH Devanagari Extra" w:hAnsi="BRH Devanagari Extra" w:cs="BRH Devanagari Extra"/>
+                <w:color w:val="000000"/>
+                <w:sz w:val="32"/>
+                <w:szCs w:val="40"/>
+              </w:rPr>
+              <w:t xml:space="preserve"> xÉÏwÉkÉÉÌiÉ | </w:t>
+            </w:r>
+          </w:p>
+          <w:p>
+            <w:pPr>
+              <w:widowControl w:val="0"/>
+              <w:autoSpaceDE w:val="0"/>
+              <w:autoSpaceDN w:val="0"/>
+              <w:adjustRightInd w:val="0"/>
+              <w:rPr>
+                <w:rFonts w:ascii="BRH Devanagari Extra" w:hAnsi="BRH Devanagari Extra" w:cs="BRH Devanagari Extra"/>
+                <w:color w:val="000000"/>
+                <w:sz w:val="32"/>
+                <w:szCs w:val="40"/>
+              </w:rPr>
+            </w:pPr>
+            <w:r>
+              <w:rPr>
+                <w:rFonts w:cs="BRH Devanagari Extra"/>
+                <w:color w:val="000000"/>
+                <w:szCs w:val="40"/>
+              </w:rPr>
+              <w:t>38</w:t>
+            </w:r>
+            <w:r>
+              <w:rPr>
+                <w:rFonts w:ascii="BRH Devanagari Extra" w:hAnsi="BRH Devanagari Extra" w:cs="BRH Devanagari Extra"/>
+                <w:color w:val="000000"/>
+                <w:sz w:val="32"/>
+                <w:szCs w:val="40"/>
+              </w:rPr>
+              <w:t>)</w:t>
+            </w:r>
+            <w:r>
+              <w:rPr>
+                <w:rFonts w:ascii="BRH Devanagari Extra" w:hAnsi="BRH Devanagari Extra" w:cs="BRH Devanagari Extra"/>
+                <w:color w:val="000000"/>
+                <w:sz w:val="32"/>
+                <w:szCs w:val="40"/>
+              </w:rPr>
+              <w:tab/>
+            </w:r>
+            <w:r>
+              <w:rPr>
+                <w:rFonts w:cs="BRH Devanagari Extra"/>
+                <w:color w:val="000000"/>
+                <w:szCs w:val="40"/>
+              </w:rPr>
+              <w:t>1</w:t>
+            </w:r>
+            <w:r>
+              <w:rPr>
+                <w:rFonts w:ascii="BRH Devanagari Extra" w:hAnsi="BRH Devanagari Extra" w:cs="BRH Devanagari Extra"/>
+                <w:color w:val="000000"/>
+                <w:sz w:val="32"/>
+                <w:szCs w:val="40"/>
+              </w:rPr>
+              <w:t>.</w:t>
+            </w:r>
+            <w:r>
+              <w:rPr>
+                <w:rFonts w:cs="BRH Devanagari Extra"/>
+                <w:color w:val="000000"/>
+                <w:szCs w:val="40"/>
+              </w:rPr>
+              <w:t>1</w:t>
+            </w:r>
+            <w:r>
+              <w:rPr>
+                <w:rFonts w:ascii="BRH Devanagari Extra" w:hAnsi="BRH Devanagari Extra" w:cs="BRH Devanagari Extra"/>
+                <w:color w:val="000000"/>
+                <w:sz w:val="32"/>
+                <w:szCs w:val="40"/>
+              </w:rPr>
+              <w:t>.</w:t>
+            </w:r>
+            <w:r>
+              <w:rPr>
+                <w:rFonts w:cs="BRH Devanagari Extra"/>
+                <w:color w:val="000000"/>
+                <w:szCs w:val="40"/>
+              </w:rPr>
+              <w:t>14</w:t>
+            </w:r>
+            <w:r>
+              <w:rPr>
+                <w:rFonts w:ascii="BRH Devanagari Extra" w:hAnsi="BRH Devanagari Extra" w:cs="BRH Devanagari Extra"/>
+                <w:color w:val="000000"/>
+                <w:sz w:val="32"/>
+                <w:szCs w:val="40"/>
+              </w:rPr>
+              <w:t>.</w:t>
+            </w:r>
+            <w:r>
+              <w:rPr>
+                <w:rFonts w:cs="BRH Devanagari Extra"/>
+                <w:color w:val="000000"/>
+                <w:szCs w:val="40"/>
+              </w:rPr>
+              <w:t>2</w:t>
+            </w:r>
+            <w:r>
+              <w:rPr>
+                <w:rFonts w:ascii="BRH Devanagari Extra" w:hAnsi="BRH Devanagari Extra" w:cs="BRH Devanagari Extra"/>
+                <w:color w:val="000000"/>
+                <w:sz w:val="32"/>
+                <w:szCs w:val="40"/>
+              </w:rPr>
+              <w:t>(</w:t>
+            </w:r>
+            <w:r>
+              <w:rPr>
+                <w:rFonts w:cs="BRH Devanagari Extra"/>
+                <w:color w:val="000000"/>
+                <w:szCs w:val="40"/>
+              </w:rPr>
+              <w:t>34</w:t>
+            </w:r>
+            <w:r>
+              <w:rPr>
+                <w:rFonts w:ascii="BRH Devanagari Extra" w:hAnsi="BRH Devanagari Extra" w:cs="BRH Devanagari Extra"/>
+                <w:color w:val="000000"/>
+                <w:sz w:val="32"/>
+                <w:szCs w:val="40"/>
+              </w:rPr>
+              <w:t>)- cÉ</w:t>
+            </w:r>
+            <w:r>
+              <w:rPr>
+                <w:rFonts w:ascii="BRH Malayalam Extra" w:hAnsi="BRH Malayalam Extra" w:cs="BRH Devanagari Extra"/>
+                <w:color w:val="000000"/>
+                <w:szCs w:val="40"/>
+              </w:rPr>
+              <w:t>–</w:t>
+            </w:r>
+            <w:r>
+              <w:rPr>
+                <w:rFonts w:ascii="BRH Devanagari Extra" w:hAnsi="BRH Devanagari Extra" w:cs="BRH Devanagari Extra"/>
+                <w:color w:val="000000"/>
+                <w:sz w:val="32"/>
+                <w:szCs w:val="40"/>
+                <w:highlight w:val="green"/>
+              </w:rPr>
+              <w:t>lSìÉaÉëÉ</w:t>
+            </w:r>
+            <w:r>
+              <w:rPr>
+                <w:rFonts w:ascii="BRH Devanagari Extra" w:hAnsi="BRH Devanagari Extra" w:cs="BRH Devanagari Extra"/>
+                <w:color w:val="000000"/>
+                <w:sz w:val="32"/>
+                <w:szCs w:val="40"/>
+                <w:highlight w:val="yellow"/>
+              </w:rPr>
+              <w:t>ÿ</w:t>
+            </w:r>
+            <w:r>
+              <w:rPr>
+                <w:rFonts w:ascii="BRH Devanagari Extra" w:hAnsi="BRH Devanagari Extra" w:cs="BRH Devanagari Extra"/>
+                <w:color w:val="000000"/>
+                <w:sz w:val="32"/>
+                <w:szCs w:val="40"/>
+              </w:rPr>
+              <w:t>È |</w:t>
+            </w:r>
+          </w:p>
+          <w:p>
+            <w:pPr>
+              <w:widowControl w:val="0"/>
+              <w:autoSpaceDE w:val="0"/>
+              <w:autoSpaceDN w:val="0"/>
+              <w:adjustRightInd w:val="0"/>
+              <w:rPr>
+                <w:rFonts w:ascii="BRH Devanagari Extra" w:hAnsi="BRH Devanagari Extra" w:cs="BRH Devanagari Extra"/>
+                <w:color w:val="000000"/>
+                <w:sz w:val="32"/>
+                <w:szCs w:val="40"/>
+              </w:rPr>
+            </w:pPr>
+            <w:r>
+              <w:rPr>
+                <w:rFonts w:ascii="BRH Devanagari Extra" w:hAnsi="BRH Devanagari Extra" w:cs="BRH Devanagari Extra"/>
+                <w:color w:val="000000"/>
+                <w:sz w:val="32"/>
+                <w:szCs w:val="40"/>
+              </w:rPr>
+              <w:t>cÉ</w:t>
+            </w:r>
+            <w:r>
+              <w:rPr>
+                <w:rFonts w:ascii="BRH Malayalam Extra" w:hAnsi="BRH Malayalam Extra" w:cs="BRH Devanagari Extra"/>
+                <w:color w:val="000000"/>
+                <w:szCs w:val="40"/>
+              </w:rPr>
+              <w:t>–</w:t>
+            </w:r>
+            <w:r>
+              <w:rPr>
+                <w:rFonts w:ascii="BRH Devanagari Extra" w:hAnsi="BRH Devanagari Extra" w:cs="BRH Devanagari Extra"/>
+                <w:color w:val="000000"/>
+                <w:sz w:val="32"/>
+                <w:szCs w:val="40"/>
+              </w:rPr>
+              <w:t>lSìÉaÉëÉ</w:t>
+            </w:r>
+            <w:r>
+              <w:rPr>
+                <w:rFonts w:ascii="BRH Malayalam Extra" w:hAnsi="BRH Malayalam Extra" w:cs="BRH Devanagari Extra"/>
+                <w:color w:val="000000"/>
+                <w:szCs w:val="40"/>
+              </w:rPr>
+              <w:t>–</w:t>
+            </w:r>
+            <w:r>
+              <w:rPr>
+                <w:rFonts w:ascii="BRH Devanagari Extra" w:hAnsi="BRH Devanagari Extra" w:cs="BRH Devanagari Extra"/>
+                <w:color w:val="000000"/>
+                <w:sz w:val="32"/>
+                <w:szCs w:val="40"/>
+              </w:rPr>
+              <w:t xml:space="preserve"> CÌiÉþ cÉ</w:t>
+            </w:r>
+            <w:r>
+              <w:rPr>
+                <w:rFonts w:ascii="BRH Malayalam Extra" w:hAnsi="BRH Malayalam Extra" w:cs="BRH Devanagari Extra"/>
+                <w:color w:val="000000"/>
+                <w:szCs w:val="40"/>
+              </w:rPr>
+              <w:t>–</w:t>
+            </w:r>
+            <w:r>
+              <w:rPr>
+                <w:rFonts w:ascii="BRH Devanagari Extra" w:hAnsi="BRH Devanagari Extra" w:cs="BRH Devanagari Extra"/>
+                <w:color w:val="000000"/>
+                <w:sz w:val="32"/>
+                <w:szCs w:val="40"/>
+              </w:rPr>
+              <w:t>lSì - A</w:t>
+            </w:r>
+            <w:r>
+              <w:rPr>
+                <w:rFonts w:ascii="BRH Malayalam Extra" w:hAnsi="BRH Malayalam Extra" w:cs="BRH Devanagari Extra"/>
+                <w:color w:val="000000"/>
+                <w:szCs w:val="40"/>
+              </w:rPr>
+              <w:t>–</w:t>
+            </w:r>
+            <w:r>
+              <w:rPr>
+                <w:rFonts w:ascii="BRH Devanagari Extra" w:hAnsi="BRH Devanagari Extra" w:cs="BRH Devanagari Extra"/>
+                <w:color w:val="000000"/>
+                <w:sz w:val="32"/>
+                <w:szCs w:val="40"/>
+              </w:rPr>
+              <w:t>aÉëÉ</w:t>
+            </w:r>
+            <w:r>
+              <w:rPr>
+                <w:rFonts w:ascii="BRH Malayalam Extra" w:hAnsi="BRH Malayalam Extra" w:cs="BRH Devanagari Extra"/>
+                <w:color w:val="000000"/>
+                <w:szCs w:val="40"/>
+              </w:rPr>
+              <w:t>–</w:t>
+            </w:r>
+            <w:r>
+              <w:rPr>
+                <w:rFonts w:ascii="BRH Devanagari Extra" w:hAnsi="BRH Devanagari Extra" w:cs="BRH Devanagari Extra"/>
+                <w:color w:val="000000"/>
+                <w:sz w:val="32"/>
+                <w:szCs w:val="40"/>
+              </w:rPr>
+              <w:t xml:space="preserve">È | </w:t>
+            </w:r>
+          </w:p>
+          <w:p>
+            <w:pPr>
+              <w:widowControl w:val="0"/>
+              <w:autoSpaceDE w:val="0"/>
+              <w:autoSpaceDN w:val="0"/>
+              <w:adjustRightInd w:val="0"/>
+              <w:rPr>
+                <w:rFonts w:ascii="BRH Devanagari Extra" w:hAnsi="BRH Devanagari Extra" w:cs="BRH Devanagari Extra"/>
+                <w:color w:val="000000"/>
+                <w:sz w:val="32"/>
+                <w:szCs w:val="40"/>
+              </w:rPr>
+            </w:pPr>
+            <w:r>
+              <w:rPr>
+                <w:rFonts w:ascii="BRH Devanagari Extra" w:hAnsi="BRH Devanagari Extra" w:cs="BRH Devanagari Extra"/>
+                <w:color w:val="000000"/>
+                <w:sz w:val="32"/>
+                <w:szCs w:val="40"/>
+              </w:rPr>
+              <w:t>cÉ</w:t>
+            </w:r>
+            <w:r>
+              <w:rPr>
+                <w:rFonts w:ascii="BRH Malayalam Extra" w:hAnsi="BRH Malayalam Extra" w:cs="BRH Devanagari Extra"/>
+                <w:color w:val="000000"/>
+                <w:szCs w:val="40"/>
+              </w:rPr>
+              <w:t>–</w:t>
+            </w:r>
+            <w:r>
+              <w:rPr>
+                <w:rFonts w:ascii="BRH Devanagari Extra" w:hAnsi="BRH Devanagari Extra" w:cs="BRH Devanagari Extra"/>
+                <w:color w:val="000000"/>
+                <w:sz w:val="32"/>
+                <w:szCs w:val="40"/>
+              </w:rPr>
+              <w:t>lSìÉaÉëÉ</w:t>
+            </w:r>
+            <w:r>
+              <w:rPr>
+                <w:rFonts w:ascii="BRH Malayalam Extra" w:hAnsi="BRH Malayalam Extra" w:cs="BRH Devanagari Extra"/>
+                <w:color w:val="000000"/>
+                <w:szCs w:val="40"/>
+              </w:rPr>
+              <w:t>–</w:t>
+            </w:r>
+            <w:r>
+              <w:rPr>
+                <w:rFonts w:ascii="BRH Devanagari Extra" w:hAnsi="BRH Devanagari Extra" w:cs="BRH Devanagari Extra"/>
+                <w:color w:val="000000"/>
+                <w:sz w:val="32"/>
+                <w:szCs w:val="40"/>
+              </w:rPr>
+              <w:t xml:space="preserve"> CÌiÉþ cÉ</w:t>
+            </w:r>
+            <w:r>
+              <w:rPr>
+                <w:rFonts w:ascii="BRH Malayalam Extra" w:hAnsi="BRH Malayalam Extra" w:cs="BRH Devanagari Extra"/>
+                <w:color w:val="000000"/>
+                <w:szCs w:val="40"/>
+              </w:rPr>
+              <w:t>–</w:t>
+            </w:r>
+            <w:r>
+              <w:rPr>
+                <w:rFonts w:ascii="BRH Devanagari Extra" w:hAnsi="BRH Devanagari Extra" w:cs="BRH Devanagari Extra"/>
+                <w:color w:val="000000"/>
+                <w:sz w:val="32"/>
+                <w:szCs w:val="40"/>
+              </w:rPr>
+              <w:t>lSì - A</w:t>
+            </w:r>
+            <w:r>
+              <w:rPr>
+                <w:rFonts w:ascii="BRH Malayalam Extra" w:hAnsi="BRH Malayalam Extra" w:cs="BRH Devanagari Extra"/>
+                <w:color w:val="000000"/>
+                <w:szCs w:val="40"/>
+              </w:rPr>
+              <w:t>–</w:t>
+            </w:r>
+            <w:r>
+              <w:rPr>
+                <w:rFonts w:ascii="BRH Devanagari Extra" w:hAnsi="BRH Devanagari Extra" w:cs="BRH Devanagari Extra"/>
+                <w:color w:val="000000"/>
+                <w:sz w:val="32"/>
+                <w:szCs w:val="40"/>
+              </w:rPr>
+              <w:t>aÉëÉ</w:t>
+            </w:r>
+            <w:r>
+              <w:rPr>
+                <w:rFonts w:ascii="BRH Malayalam Extra" w:hAnsi="BRH Malayalam Extra" w:cs="BRH Devanagari Extra"/>
+                <w:color w:val="000000"/>
+                <w:szCs w:val="40"/>
+              </w:rPr>
+              <w:t>–</w:t>
+            </w:r>
+            <w:r>
+              <w:rPr>
+                <w:rFonts w:ascii="BRH Devanagari Extra" w:hAnsi="BRH Devanagari Extra" w:cs="BRH Devanagari Extra"/>
+                <w:color w:val="000000"/>
+                <w:sz w:val="32"/>
+                <w:szCs w:val="40"/>
+              </w:rPr>
+              <w:t xml:space="preserve">È | </w:t>
+            </w:r>
+          </w:p>
+          <w:p>
+            <w:pPr>
+              <w:widowControl w:val="0"/>
+              <w:autoSpaceDE w:val="0"/>
+              <w:autoSpaceDN w:val="0"/>
+              <w:adjustRightInd w:val="0"/>
+              <w:rPr>
+                <w:rFonts w:cs="BRH Devanagari Extra"/>
+                <w:color w:val="000000"/>
+                <w:szCs w:val="40"/>
+              </w:rPr>
+            </w:pPr>
           </w:p>
         </w:tc>
       </w:tr>
@@ -2547,7 +6876,6 @@
           <w:sz w:val="32"/>
           <w:szCs w:val="32"/>
           <w:u w:val="single"/>
-          <w:lang w:val="it-IT"/>
         </w:rPr>
       </w:pPr>
     </w:p>
@@ -3090,7 +7418,6 @@
                 <w:sz w:val="32"/>
                 <w:szCs w:val="40"/>
               </w:rPr>
-              <w:lastRenderedPageBreak/>
               <w:t>A</w:t>
             </w:r>
             <w:r>
@@ -3422,7 +7749,6 @@
                 <w:szCs w:val="28"/>
                 <w:u w:val="single"/>
               </w:rPr>
-              <w:lastRenderedPageBreak/>
               <w:t>TS 1.1.1.1– Ghanam</w:t>
             </w:r>
           </w:p>
@@ -3611,7 +7937,16 @@
                 <w:sz w:val="32"/>
                 <w:szCs w:val="40"/>
               </w:rPr>
-              <w:t>zÉ(aqÉç)</w:t>
+              <w:t>zÉ(</w:t>
+            </w:r>
+            <w:proofErr w:type="gramStart"/>
+            <w:r>
+              <w:rPr>
+                <w:rFonts w:ascii="BRH Devanagari Extra" w:hAnsi="BRH Devanagari Extra" w:cs="BRH Devanagari Extra"/>
+                <w:sz w:val="32"/>
+                <w:szCs w:val="40"/>
+              </w:rPr>
+              <w:t>aqÉç)</w:t>
             </w:r>
             <w:r>
               <w:rPr>
@@ -3619,7 +7954,16 @@
                 <w:sz w:val="32"/>
                 <w:szCs w:val="40"/>
               </w:rPr>
-              <w:t xml:space="preserve">  | </w:t>
+              <w:t xml:space="preserve">  |</w:t>
+            </w:r>
+            <w:proofErr w:type="gramEnd"/>
+            <w:r>
+              <w:rPr>
+                <w:rFonts w:ascii="BRH Malayalam Extra" w:hAnsi="BRH Malayalam Extra" w:cs="BRH Malayalam Extra"/>
+                <w:sz w:val="32"/>
+                <w:szCs w:val="40"/>
+              </w:rPr>
+              <w:t xml:space="preserve"> </w:t>
             </w:r>
             <w:r>
               <w:rPr>
@@ -3743,7 +8087,6 @@
                 <w:sz w:val="32"/>
                 <w:szCs w:val="40"/>
               </w:rPr>
-              <w:lastRenderedPageBreak/>
               <w:t>A</w:t>
             </w:r>
             <w:r>
@@ -3910,7 +8253,16 @@
                 <w:sz w:val="32"/>
                 <w:szCs w:val="40"/>
               </w:rPr>
-              <w:t>zÉ(aqÉç)</w:t>
+              <w:t>zÉ(</w:t>
+            </w:r>
+            <w:proofErr w:type="gramStart"/>
+            <w:r>
+              <w:rPr>
+                <w:rFonts w:ascii="BRH Devanagari Extra" w:hAnsi="BRH Devanagari Extra" w:cs="BRH Devanagari Extra"/>
+                <w:sz w:val="32"/>
+                <w:szCs w:val="40"/>
+              </w:rPr>
+              <w:t>aqÉç)</w:t>
             </w:r>
             <w:r>
               <w:rPr>
@@ -3918,7 +8270,16 @@
                 <w:sz w:val="32"/>
                 <w:szCs w:val="40"/>
               </w:rPr>
-              <w:t xml:space="preserve">  | </w:t>
+              <w:t xml:space="preserve">  |</w:t>
+            </w:r>
+            <w:proofErr w:type="gramEnd"/>
+            <w:r>
+              <w:rPr>
+                <w:rFonts w:ascii="BRH Malayalam Extra" w:hAnsi="BRH Malayalam Extra" w:cs="BRH Malayalam Extra"/>
+                <w:sz w:val="32"/>
+                <w:szCs w:val="40"/>
+              </w:rPr>
+              <w:t xml:space="preserve"> </w:t>
             </w:r>
             <w:r>
               <w:rPr>
@@ -5806,7 +10167,6 @@
                 <w:color w:val="000000"/>
                 <w:szCs w:val="40"/>
               </w:rPr>
-              <w:lastRenderedPageBreak/>
               <w:t>3</w:t>
             </w:r>
             <w:r>
@@ -6303,6 +10663,7 @@
                 <w:color w:val="000000"/>
                 <w:szCs w:val="40"/>
               </w:rPr>
+              <w:lastRenderedPageBreak/>
               <w:t>4</w:t>
             </w:r>
             <w:r>
@@ -6737,6 +11098,7 @@
                 <w:color w:val="000000"/>
                 <w:szCs w:val="40"/>
               </w:rPr>
+              <w:lastRenderedPageBreak/>
               <w:t>3</w:t>
             </w:r>
             <w:r>
@@ -7225,6 +11587,7 @@
                 <w:color w:val="000000"/>
                 <w:szCs w:val="40"/>
               </w:rPr>
+              <w:lastRenderedPageBreak/>
               <w:t>4</w:t>
             </w:r>
             <w:r>
@@ -7657,6 +12020,7 @@
                 <w:szCs w:val="28"/>
                 <w:u w:val="single"/>
               </w:rPr>
+              <w:lastRenderedPageBreak/>
               <w:t>TS 1.1.8.1 Ghanam</w:t>
             </w:r>
           </w:p>
@@ -8378,7 +12742,6 @@
                 <w:color w:val="000000"/>
                 <w:szCs w:val="40"/>
               </w:rPr>
-              <w:lastRenderedPageBreak/>
               <w:t>26</w:t>
             </w:r>
             <w:r>
@@ -9247,6 +13610,7 @@
                 <w:color w:val="000000"/>
                 <w:szCs w:val="40"/>
               </w:rPr>
+              <w:lastRenderedPageBreak/>
               <w:t>48</w:t>
             </w:r>
             <w:r>
@@ -9588,6 +13952,7 @@
                 <w:color w:val="000000"/>
                 <w:szCs w:val="40"/>
               </w:rPr>
+              <w:lastRenderedPageBreak/>
               <w:t>46</w:t>
             </w:r>
             <w:r>
@@ -9994,6 +14359,7 @@
                 <w:color w:val="000000"/>
                 <w:szCs w:val="40"/>
               </w:rPr>
+              <w:lastRenderedPageBreak/>
               <w:t>47</w:t>
             </w:r>
             <w:r>
@@ -10363,6 +14729,7 @@
                 <w:color w:val="000000"/>
                 <w:szCs w:val="40"/>
               </w:rPr>
+              <w:lastRenderedPageBreak/>
               <w:t>43</w:t>
             </w:r>
             <w:r>
@@ -11104,7 +15471,6 @@
                 <w:sz w:val="32"/>
                 <w:szCs w:val="40"/>
               </w:rPr>
-              <w:lastRenderedPageBreak/>
               <w:t>Så</w:t>
             </w:r>
             <w:r>
@@ -11779,7 +16145,6 @@
                 <w:color w:val="000000"/>
                 <w:szCs w:val="40"/>
               </w:rPr>
-              <w:lastRenderedPageBreak/>
               <w:t>43</w:t>
             </w:r>
             <w:r>
@@ -12554,7 +16919,6 @@
                 <w:sz w:val="32"/>
                 <w:szCs w:val="40"/>
               </w:rPr>
-              <w:lastRenderedPageBreak/>
               <w:t>Så</w:t>
             </w:r>
             <w:r>
@@ -13830,7 +18194,6 @@
                 <w:color w:val="000000"/>
                 <w:szCs w:val="40"/>
               </w:rPr>
-              <w:lastRenderedPageBreak/>
               <w:t>26</w:t>
             </w:r>
             <w:r>
@@ -18128,6 +22491,7 @@
                 <w:szCs w:val="40"/>
                 <w:lang w:val="it-IT"/>
               </w:rPr>
+              <w:lastRenderedPageBreak/>
               <w:t>29</w:t>
             </w:r>
             <w:r>
@@ -18631,7 +22995,6 @@
                 <w:szCs w:val="40"/>
                 <w:lang w:val="it-IT"/>
               </w:rPr>
-              <w:lastRenderedPageBreak/>
               <w:t>1</w:t>
             </w:r>
             <w:r>
@@ -22854,6 +27217,7 @@
           <w:szCs w:val="32"/>
           <w:u w:val="single"/>
         </w:rPr>
+        <w:lastRenderedPageBreak/>
         <w:t xml:space="preserve">TS </w:t>
       </w:r>
       <w:r>
@@ -23155,7 +27519,6 @@
                 <w:sz w:val="28"/>
                 <w:szCs w:val="28"/>
               </w:rPr>
-              <w:lastRenderedPageBreak/>
               <w:t>TS 1.</w:t>
             </w:r>
             <w:r>

</xml_diff>